<commit_message>
correciones de busqueda y direccionamiento
</commit_message>
<xml_diff>
--- a/analisis/Mini-analisis.docx
+++ b/analisis/Mini-analisis.docx
@@ -4,8 +4,10 @@
   <w:body>
     <w:p>
       <w:pPr>
+        <w:spacing w:line="360" w:lineRule="auto"/>
         <w:jc w:val="center"/>
         <w:rPr>
+          <w:rFonts w:ascii="Arial" w:hAnsi="Arial" w:cs="Arial"/>
           <w:b/>
           <w:bCs/>
           <w:sz w:val="28"/>
@@ -14,6 +16,7 @@
       </w:pPr>
       <w:r>
         <w:rPr>
+          <w:rFonts w:ascii="Arial" w:hAnsi="Arial" w:cs="Arial"/>
           <w:b/>
           <w:bCs/>
           <w:sz w:val="28"/>
@@ -22,13 +25,25 @@
         <w:t>Tecnológico Nacional De México Campus Chilpancingo</w:t>
       </w:r>
     </w:p>
-    <w:p/>
     <w:p>
       <w:pPr>
+        <w:spacing w:line="360" w:lineRule="auto"/>
+        <w:rPr>
+          <w:rFonts w:ascii="Arial" w:hAnsi="Arial" w:cs="Arial"/>
+        </w:rPr>
+      </w:pPr>
+    </w:p>
+    <w:p>
+      <w:pPr>
+        <w:spacing w:line="360" w:lineRule="auto"/>
         <w:jc w:val="center"/>
-      </w:pPr>
-      <w:r>
-        <w:rPr>
+        <w:rPr>
+          <w:rFonts w:ascii="Arial" w:hAnsi="Arial" w:cs="Arial"/>
+        </w:rPr>
+      </w:pPr>
+      <w:r>
+        <w:rPr>
+          <w:rFonts w:ascii="Arial" w:hAnsi="Arial" w:cs="Arial"/>
           <w:noProof/>
         </w:rPr>
         <w:drawing>
@@ -74,53 +89,97 @@
         </w:drawing>
       </w:r>
     </w:p>
-    <w:p/>
     <w:p>
       <w:pPr>
-        <w:jc w:val="center"/>
-      </w:pPr>
-      <w:r>
-        <w:t>Tópicos Selectos de Programación Web</w:t>
-      </w:r>
+        <w:spacing w:line="360" w:lineRule="auto"/>
+        <w:rPr>
+          <w:rFonts w:ascii="Arial" w:hAnsi="Arial" w:cs="Arial"/>
+        </w:rPr>
+      </w:pPr>
     </w:p>
     <w:p>
       <w:pPr>
+        <w:spacing w:line="360" w:lineRule="auto"/>
         <w:jc w:val="center"/>
-      </w:pPr>
-      <w:r>
-        <w:t xml:space="preserve"> </w:t>
-      </w:r>
-      <w:r>
-        <w:t>Análisis de Tutoría</w:t>
+        <w:rPr>
+          <w:rFonts w:ascii="Arial" w:hAnsi="Arial" w:cs="Arial"/>
+        </w:rPr>
+      </w:pPr>
+      <w:r>
+        <w:rPr>
+          <w:rFonts w:ascii="Arial" w:hAnsi="Arial" w:cs="Arial"/>
+        </w:rPr>
+        <w:t>Tópicos Selectos de Programación Web</w:t>
       </w:r>
     </w:p>
     <w:p>
       <w:pPr>
+        <w:spacing w:line="360" w:lineRule="auto"/>
         <w:jc w:val="center"/>
-      </w:pPr>
-      <w:r>
-        <w:t xml:space="preserve"> </w:t>
-      </w:r>
-      <w:r>
-        <w:t xml:space="preserve">Jose Emmannuel Pedraza Romero </w:t>
+        <w:rPr>
+          <w:rFonts w:ascii="Arial" w:hAnsi="Arial" w:cs="Arial"/>
+        </w:rPr>
+      </w:pPr>
+      <w:r>
+        <w:rPr>
+          <w:rFonts w:ascii="Arial" w:hAnsi="Arial" w:cs="Arial"/>
+        </w:rPr>
+        <w:t xml:space="preserve"> Análisis de Tutoría</w:t>
       </w:r>
     </w:p>
     <w:p>
       <w:pPr>
+        <w:spacing w:line="360" w:lineRule="auto"/>
         <w:jc w:val="center"/>
-      </w:pPr>
-      <w:r>
-        <w:t>22520213</w:t>
+        <w:rPr>
+          <w:rFonts w:ascii="Arial" w:hAnsi="Arial" w:cs="Arial"/>
+        </w:rPr>
+      </w:pPr>
+      <w:r>
+        <w:rPr>
+          <w:rFonts w:ascii="Arial" w:hAnsi="Arial" w:cs="Arial"/>
+        </w:rPr>
+        <w:t xml:space="preserve"> Jose Emmannuel Pedraza Romero </w:t>
       </w:r>
     </w:p>
     <w:p>
-      <w:r>
+      <w:pPr>
+        <w:spacing w:line="360" w:lineRule="auto"/>
+        <w:jc w:val="center"/>
+        <w:rPr>
+          <w:rFonts w:ascii="Arial" w:hAnsi="Arial" w:cs="Arial"/>
+        </w:rPr>
+      </w:pPr>
+      <w:r>
+        <w:rPr>
+          <w:rFonts w:ascii="Arial" w:hAnsi="Arial" w:cs="Arial"/>
+        </w:rPr>
+        <w:t>22520213</w:t>
+      </w:r>
+    </w:p>
+    <w:p>
+      <w:pPr>
+        <w:spacing w:line="360" w:lineRule="auto"/>
+        <w:rPr>
+          <w:rFonts w:ascii="Arial" w:hAnsi="Arial" w:cs="Arial"/>
+        </w:rPr>
+      </w:pPr>
+      <w:r>
+        <w:rPr>
+          <w:rFonts w:ascii="Arial" w:hAnsi="Arial" w:cs="Arial"/>
+        </w:rPr>
         <w:br w:type="page"/>
       </w:r>
     </w:p>
     <w:sdt>
       <w:sdtPr>
         <w:rPr>
+          <w:rFonts w:ascii="Arial" w:eastAsia="Times New Roman" w:hAnsi="Arial" w:cs="Arial"/>
+          <w:b w:val="0"/>
+          <w:bCs w:val="0"/>
+          <w:color w:val="auto"/>
+          <w:sz w:val="24"/>
+          <w:szCs w:val="24"/>
           <w:lang w:val="es-ES"/>
         </w:rPr>
         <w:id w:val="-1371371022"/>
@@ -131,11 +190,7 @@
       </w:sdtPr>
       <w:sdtEndPr>
         <w:rPr>
-          <w:rFonts w:ascii="Times New Roman" w:eastAsia="Times New Roman" w:hAnsi="Times New Roman" w:cs="Times New Roman"/>
           <w:noProof/>
-          <w:color w:val="auto"/>
-          <w:sz w:val="24"/>
-          <w:szCs w:val="24"/>
           <w:lang w:val="es-MX"/>
         </w:rPr>
       </w:sdtEndPr>
@@ -143,13 +198,20 @@
         <w:p>
           <w:pPr>
             <w:pStyle w:val="TtuloTDC"/>
+            <w:spacing w:line="360" w:lineRule="auto"/>
             <w:jc w:val="center"/>
+            <w:rPr>
+              <w:rFonts w:ascii="Arial" w:hAnsi="Arial" w:cs="Arial"/>
+              <w:color w:val="000000" w:themeColor="text1"/>
+            </w:rPr>
           </w:pPr>
           <w:r>
             <w:rPr>
+              <w:rFonts w:ascii="Arial" w:hAnsi="Arial" w:cs="Arial"/>
+              <w:color w:val="000000" w:themeColor="text1"/>
               <w:lang w:val="es-ES"/>
             </w:rPr>
-            <w:t>Índice</w:t>
+            <w:t>ÍNDICE</w:t>
           </w:r>
         </w:p>
         <w:p>
@@ -171,22 +233,27 @@
           </w:pPr>
           <w:r>
             <w:rPr>
+              <w:rFonts w:ascii="Arial" w:hAnsi="Arial" w:cs="Arial"/>
               <w:b w:val="0"/>
               <w:bCs w:val="0"/>
             </w:rPr>
             <w:fldChar w:fldCharType="begin"/>
           </w:r>
           <w:r>
+            <w:rPr>
+              <w:rFonts w:ascii="Arial" w:hAnsi="Arial" w:cs="Arial"/>
+            </w:rPr>
             <w:instrText>TOC \o "1-3" \h \z \u</w:instrText>
           </w:r>
           <w:r>
             <w:rPr>
+              <w:rFonts w:ascii="Arial" w:hAnsi="Arial" w:cs="Arial"/>
               <w:b w:val="0"/>
               <w:bCs w:val="0"/>
             </w:rPr>
             <w:fldChar w:fldCharType="separate"/>
           </w:r>
-          <w:hyperlink w:anchor="_Toc227795035" w:history="1">
+          <w:hyperlink w:anchor="_Toc229498343" w:history="1">
             <w:r>
               <w:rPr>
                 <w:rStyle w:val="Hipervnculo"/>
@@ -214,7 +281,7 @@
                 <w:noProof/>
                 <w:webHidden/>
               </w:rPr>
-              <w:instrText xml:space="preserve"> PAGEREF _Toc227795035 \h </w:instrText>
+              <w:instrText xml:space="preserve"> PAGEREF _Toc229498343 \h </w:instrText>
             </w:r>
             <w:r>
               <w:rPr>
@@ -235,6 +302,541 @@
                 <w:webHidden/>
               </w:rPr>
               <w:t>3</w:t>
+            </w:r>
+            <w:r>
+              <w:rPr>
+                <w:noProof/>
+                <w:webHidden/>
+              </w:rPr>
+              <w:fldChar w:fldCharType="end"/>
+            </w:r>
+          </w:hyperlink>
+        </w:p>
+        <w:p>
+          <w:pPr>
+            <w:pStyle w:val="TDC2"/>
+            <w:tabs>
+              <w:tab w:val="right" w:leader="dot" w:pos="9350"/>
+            </w:tabs>
+            <w:rPr>
+              <w:rFonts w:eastAsiaTheme="minorEastAsia"/>
+              <w:smallCaps w:val="0"/>
+              <w:noProof/>
+              <w:sz w:val="24"/>
+              <w:szCs w:val="24"/>
+              <w:lang w:eastAsia="es-MX"/>
+            </w:rPr>
+          </w:pPr>
+          <w:hyperlink w:anchor="_Toc229498344" w:history="1">
+            <w:r>
+              <w:rPr>
+                <w:rStyle w:val="Hipervnculo"/>
+                <w:rFonts w:ascii="Arial" w:hAnsi="Arial" w:cs="Arial"/>
+                <w:b/>
+                <w:bCs/>
+                <w:noProof/>
+              </w:rPr>
+              <w:t>Estructura Organizacional y Actores Clave</w:t>
+            </w:r>
+            <w:r>
+              <w:rPr>
+                <w:noProof/>
+                <w:webHidden/>
+              </w:rPr>
+              <w:tab/>
+            </w:r>
+            <w:r>
+              <w:rPr>
+                <w:noProof/>
+                <w:webHidden/>
+              </w:rPr>
+              <w:fldChar w:fldCharType="begin"/>
+            </w:r>
+            <w:r>
+              <w:rPr>
+                <w:noProof/>
+                <w:webHidden/>
+              </w:rPr>
+              <w:instrText xml:space="preserve"> PAGEREF _Toc229498344 \h </w:instrText>
+            </w:r>
+            <w:r>
+              <w:rPr>
+                <w:noProof/>
+                <w:webHidden/>
+              </w:rPr>
+            </w:r>
+            <w:r>
+              <w:rPr>
+                <w:noProof/>
+                <w:webHidden/>
+              </w:rPr>
+              <w:fldChar w:fldCharType="separate"/>
+            </w:r>
+            <w:r>
+              <w:rPr>
+                <w:noProof/>
+                <w:webHidden/>
+              </w:rPr>
+              <w:t>3</w:t>
+            </w:r>
+            <w:r>
+              <w:rPr>
+                <w:noProof/>
+                <w:webHidden/>
+              </w:rPr>
+              <w:fldChar w:fldCharType="end"/>
+            </w:r>
+          </w:hyperlink>
+        </w:p>
+        <w:p>
+          <w:pPr>
+            <w:pStyle w:val="TDC3"/>
+            <w:tabs>
+              <w:tab w:val="right" w:leader="dot" w:pos="9350"/>
+            </w:tabs>
+            <w:rPr>
+              <w:rFonts w:eastAsiaTheme="minorEastAsia"/>
+              <w:i w:val="0"/>
+              <w:iCs w:val="0"/>
+              <w:noProof/>
+              <w:sz w:val="24"/>
+              <w:szCs w:val="24"/>
+              <w:lang w:eastAsia="es-MX"/>
+            </w:rPr>
+          </w:pPr>
+          <w:hyperlink w:anchor="_Toc229498345" w:history="1">
+            <w:r>
+              <w:rPr>
+                <w:rStyle w:val="Hipervnculo"/>
+                <w:rFonts w:ascii="Arial" w:hAnsi="Arial" w:cs="Arial"/>
+                <w:b/>
+                <w:bCs/>
+                <w:noProof/>
+              </w:rPr>
+              <w:t>Jerarquía de Coordinación</w:t>
+            </w:r>
+            <w:r>
+              <w:rPr>
+                <w:noProof/>
+                <w:webHidden/>
+              </w:rPr>
+              <w:tab/>
+            </w:r>
+            <w:r>
+              <w:rPr>
+                <w:noProof/>
+                <w:webHidden/>
+              </w:rPr>
+              <w:fldChar w:fldCharType="begin"/>
+            </w:r>
+            <w:r>
+              <w:rPr>
+                <w:noProof/>
+                <w:webHidden/>
+              </w:rPr>
+              <w:instrText xml:space="preserve"> PAGEREF _Toc229498345 \h </w:instrText>
+            </w:r>
+            <w:r>
+              <w:rPr>
+                <w:noProof/>
+                <w:webHidden/>
+              </w:rPr>
+            </w:r>
+            <w:r>
+              <w:rPr>
+                <w:noProof/>
+                <w:webHidden/>
+              </w:rPr>
+              <w:fldChar w:fldCharType="separate"/>
+            </w:r>
+            <w:r>
+              <w:rPr>
+                <w:noProof/>
+                <w:webHidden/>
+              </w:rPr>
+              <w:t>3</w:t>
+            </w:r>
+            <w:r>
+              <w:rPr>
+                <w:noProof/>
+                <w:webHidden/>
+              </w:rPr>
+              <w:fldChar w:fldCharType="end"/>
+            </w:r>
+          </w:hyperlink>
+        </w:p>
+        <w:p>
+          <w:pPr>
+            <w:pStyle w:val="TDC3"/>
+            <w:tabs>
+              <w:tab w:val="right" w:leader="dot" w:pos="9350"/>
+            </w:tabs>
+            <w:rPr>
+              <w:rFonts w:eastAsiaTheme="minorEastAsia"/>
+              <w:i w:val="0"/>
+              <w:iCs w:val="0"/>
+              <w:noProof/>
+              <w:sz w:val="24"/>
+              <w:szCs w:val="24"/>
+              <w:lang w:eastAsia="es-MX"/>
+            </w:rPr>
+          </w:pPr>
+          <w:hyperlink w:anchor="_Toc229498346" w:history="1">
+            <w:r>
+              <w:rPr>
+                <w:rStyle w:val="Hipervnculo"/>
+                <w:rFonts w:ascii="Arial" w:hAnsi="Arial" w:cs="Arial"/>
+                <w:b/>
+                <w:bCs/>
+                <w:noProof/>
+              </w:rPr>
+              <w:t>Roles Operativos</w:t>
+            </w:r>
+            <w:r>
+              <w:rPr>
+                <w:noProof/>
+                <w:webHidden/>
+              </w:rPr>
+              <w:tab/>
+            </w:r>
+            <w:r>
+              <w:rPr>
+                <w:noProof/>
+                <w:webHidden/>
+              </w:rPr>
+              <w:fldChar w:fldCharType="begin"/>
+            </w:r>
+            <w:r>
+              <w:rPr>
+                <w:noProof/>
+                <w:webHidden/>
+              </w:rPr>
+              <w:instrText xml:space="preserve"> PAGEREF _Toc229498346 \h </w:instrText>
+            </w:r>
+            <w:r>
+              <w:rPr>
+                <w:noProof/>
+                <w:webHidden/>
+              </w:rPr>
+            </w:r>
+            <w:r>
+              <w:rPr>
+                <w:noProof/>
+                <w:webHidden/>
+              </w:rPr>
+              <w:fldChar w:fldCharType="separate"/>
+            </w:r>
+            <w:r>
+              <w:rPr>
+                <w:noProof/>
+                <w:webHidden/>
+              </w:rPr>
+              <w:t>4</w:t>
+            </w:r>
+            <w:r>
+              <w:rPr>
+                <w:noProof/>
+                <w:webHidden/>
+              </w:rPr>
+              <w:fldChar w:fldCharType="end"/>
+            </w:r>
+          </w:hyperlink>
+        </w:p>
+        <w:p>
+          <w:pPr>
+            <w:pStyle w:val="TDC2"/>
+            <w:tabs>
+              <w:tab w:val="right" w:leader="dot" w:pos="9350"/>
+            </w:tabs>
+            <w:rPr>
+              <w:rFonts w:eastAsiaTheme="minorEastAsia"/>
+              <w:smallCaps w:val="0"/>
+              <w:noProof/>
+              <w:sz w:val="24"/>
+              <w:szCs w:val="24"/>
+              <w:lang w:eastAsia="es-MX"/>
+            </w:rPr>
+          </w:pPr>
+          <w:hyperlink w:anchor="_Toc229498347" w:history="1">
+            <w:r>
+              <w:rPr>
+                <w:rStyle w:val="Hipervnculo"/>
+                <w:rFonts w:ascii="Arial" w:hAnsi="Arial" w:cs="Arial"/>
+                <w:b/>
+                <w:bCs/>
+                <w:noProof/>
+              </w:rPr>
+              <w:t>Proceso Operativo y Flujo de Trabajo</w:t>
+            </w:r>
+            <w:r>
+              <w:rPr>
+                <w:noProof/>
+                <w:webHidden/>
+              </w:rPr>
+              <w:tab/>
+            </w:r>
+            <w:r>
+              <w:rPr>
+                <w:noProof/>
+                <w:webHidden/>
+              </w:rPr>
+              <w:fldChar w:fldCharType="begin"/>
+            </w:r>
+            <w:r>
+              <w:rPr>
+                <w:noProof/>
+                <w:webHidden/>
+              </w:rPr>
+              <w:instrText xml:space="preserve"> PAGEREF _Toc229498347 \h </w:instrText>
+            </w:r>
+            <w:r>
+              <w:rPr>
+                <w:noProof/>
+                <w:webHidden/>
+              </w:rPr>
+            </w:r>
+            <w:r>
+              <w:rPr>
+                <w:noProof/>
+                <w:webHidden/>
+              </w:rPr>
+              <w:fldChar w:fldCharType="separate"/>
+            </w:r>
+            <w:r>
+              <w:rPr>
+                <w:noProof/>
+                <w:webHidden/>
+              </w:rPr>
+              <w:t>4</w:t>
+            </w:r>
+            <w:r>
+              <w:rPr>
+                <w:noProof/>
+                <w:webHidden/>
+              </w:rPr>
+              <w:fldChar w:fldCharType="end"/>
+            </w:r>
+          </w:hyperlink>
+        </w:p>
+        <w:p>
+          <w:pPr>
+            <w:pStyle w:val="TDC2"/>
+            <w:tabs>
+              <w:tab w:val="right" w:leader="dot" w:pos="9350"/>
+            </w:tabs>
+            <w:rPr>
+              <w:rFonts w:eastAsiaTheme="minorEastAsia"/>
+              <w:smallCaps w:val="0"/>
+              <w:noProof/>
+              <w:sz w:val="24"/>
+              <w:szCs w:val="24"/>
+              <w:lang w:eastAsia="es-MX"/>
+            </w:rPr>
+          </w:pPr>
+          <w:hyperlink w:anchor="_Toc229498348" w:history="1">
+            <w:r>
+              <w:rPr>
+                <w:rStyle w:val="Hipervnculo"/>
+                <w:rFonts w:ascii="Arial" w:hAnsi="Arial" w:cs="Arial"/>
+                <w:b/>
+                <w:bCs/>
+                <w:noProof/>
+              </w:rPr>
+              <w:t>Planeación y Asignación</w:t>
+            </w:r>
+            <w:r>
+              <w:rPr>
+                <w:noProof/>
+                <w:webHidden/>
+              </w:rPr>
+              <w:tab/>
+            </w:r>
+            <w:r>
+              <w:rPr>
+                <w:noProof/>
+                <w:webHidden/>
+              </w:rPr>
+              <w:fldChar w:fldCharType="begin"/>
+            </w:r>
+            <w:r>
+              <w:rPr>
+                <w:noProof/>
+                <w:webHidden/>
+              </w:rPr>
+              <w:instrText xml:space="preserve"> PAGEREF _Toc229498348 \h </w:instrText>
+            </w:r>
+            <w:r>
+              <w:rPr>
+                <w:noProof/>
+                <w:webHidden/>
+              </w:rPr>
+            </w:r>
+            <w:r>
+              <w:rPr>
+                <w:noProof/>
+                <w:webHidden/>
+              </w:rPr>
+              <w:fldChar w:fldCharType="separate"/>
+            </w:r>
+            <w:r>
+              <w:rPr>
+                <w:noProof/>
+                <w:webHidden/>
+              </w:rPr>
+              <w:t>4</w:t>
+            </w:r>
+            <w:r>
+              <w:rPr>
+                <w:noProof/>
+                <w:webHidden/>
+              </w:rPr>
+              <w:fldChar w:fldCharType="end"/>
+            </w:r>
+          </w:hyperlink>
+        </w:p>
+        <w:p>
+          <w:pPr>
+            <w:pStyle w:val="TDC2"/>
+            <w:tabs>
+              <w:tab w:val="right" w:leader="dot" w:pos="9350"/>
+            </w:tabs>
+            <w:rPr>
+              <w:rFonts w:eastAsiaTheme="minorEastAsia"/>
+              <w:smallCaps w:val="0"/>
+              <w:noProof/>
+              <w:sz w:val="24"/>
+              <w:szCs w:val="24"/>
+              <w:lang w:eastAsia="es-MX"/>
+            </w:rPr>
+          </w:pPr>
+          <w:hyperlink w:anchor="_Toc229498349" w:history="1">
+            <w:r>
+              <w:rPr>
+                <w:rStyle w:val="Hipervnculo"/>
+                <w:rFonts w:ascii="Arial" w:hAnsi="Arial" w:cs="Arial"/>
+                <w:b/>
+                <w:bCs/>
+                <w:noProof/>
+              </w:rPr>
+              <w:t>El Plan de Acción Tutorial (PAT)</w:t>
+            </w:r>
+            <w:r>
+              <w:rPr>
+                <w:noProof/>
+                <w:webHidden/>
+              </w:rPr>
+              <w:tab/>
+            </w:r>
+            <w:r>
+              <w:rPr>
+                <w:noProof/>
+                <w:webHidden/>
+              </w:rPr>
+              <w:fldChar w:fldCharType="begin"/>
+            </w:r>
+            <w:r>
+              <w:rPr>
+                <w:noProof/>
+                <w:webHidden/>
+              </w:rPr>
+              <w:instrText xml:space="preserve"> PAGEREF _Toc229498349 \h </w:instrText>
+            </w:r>
+            <w:r>
+              <w:rPr>
+                <w:noProof/>
+                <w:webHidden/>
+              </w:rPr>
+            </w:r>
+            <w:r>
+              <w:rPr>
+                <w:noProof/>
+                <w:webHidden/>
+              </w:rPr>
+              <w:fldChar w:fldCharType="separate"/>
+            </w:r>
+            <w:r>
+              <w:rPr>
+                <w:noProof/>
+                <w:webHidden/>
+              </w:rPr>
+              <w:t>5</w:t>
+            </w:r>
+            <w:r>
+              <w:rPr>
+                <w:noProof/>
+                <w:webHidden/>
+              </w:rPr>
+              <w:fldChar w:fldCharType="end"/>
+            </w:r>
+          </w:hyperlink>
+        </w:p>
+        <w:p>
+          <w:pPr>
+            <w:pStyle w:val="TDC3"/>
+            <w:tabs>
+              <w:tab w:val="right" w:leader="dot" w:pos="9350"/>
+            </w:tabs>
+            <w:rPr>
+              <w:rFonts w:eastAsiaTheme="minorEastAsia"/>
+              <w:i w:val="0"/>
+              <w:iCs w:val="0"/>
+              <w:noProof/>
+              <w:sz w:val="24"/>
+              <w:szCs w:val="24"/>
+              <w:lang w:eastAsia="es-MX"/>
+            </w:rPr>
+          </w:pPr>
+          <w:hyperlink w:anchor="_Toc229498350" w:history="1">
+            <w:r>
+              <w:rPr>
+                <w:rStyle w:val="Hipervnculo"/>
+                <w:rFonts w:ascii="Arial" w:hAnsi="Arial" w:cs="Arial"/>
+                <w:b/>
+                <w:bCs/>
+                <w:noProof/>
+              </w:rPr>
+              <w:t>Implementación Semestral</w:t>
+            </w:r>
+            <w:r>
+              <w:rPr>
+                <w:noProof/>
+                <w:webHidden/>
+              </w:rPr>
+              <w:tab/>
+            </w:r>
+            <w:r>
+              <w:rPr>
+                <w:noProof/>
+                <w:webHidden/>
+              </w:rPr>
+              <w:fldChar w:fldCharType="begin"/>
+            </w:r>
+            <w:r>
+              <w:rPr>
+                <w:noProof/>
+                <w:webHidden/>
+              </w:rPr>
+              <w:instrText xml:space="preserve"> PAGEREF _Toc229498350 \h </w:instrText>
+            </w:r>
+            <w:r>
+              <w:rPr>
+                <w:noProof/>
+                <w:webHidden/>
+              </w:rPr>
+            </w:r>
+            <w:r>
+              <w:rPr>
+                <w:noProof/>
+                <w:webHidden/>
+              </w:rPr>
+              <w:fldChar w:fldCharType="separate"/>
+            </w:r>
+            <w:r>
+              <w:rPr>
+                <w:noProof/>
+                <w:webHidden/>
+              </w:rPr>
+              <w:t>5</w:t>
             </w:r>
             <w:r>
               <w:rPr>
@@ -262,7 +864,7 @@
               <w:lang w:eastAsia="es-MX"/>
             </w:rPr>
           </w:pPr>
-          <w:hyperlink w:anchor="_Toc227795036" w:history="1">
+          <w:hyperlink w:anchor="_Toc229498351" w:history="1">
             <w:r>
               <w:rPr>
                 <w:rStyle w:val="Hipervnculo"/>
@@ -290,7 +892,7 @@
                 <w:noProof/>
                 <w:webHidden/>
               </w:rPr>
-              <w:instrText xml:space="preserve"> PAGEREF _Toc227795036 \h </w:instrText>
+              <w:instrText xml:space="preserve"> PAGEREF _Toc229498351 \h </w:instrText>
             </w:r>
             <w:r>
               <w:rPr>
@@ -310,7 +912,7 @@
                 <w:noProof/>
                 <w:webHidden/>
               </w:rPr>
-              <w:t>5</w:t>
+              <w:t>6</w:t>
             </w:r>
             <w:r>
               <w:rPr>
@@ -336,7 +938,7 @@
               <w:lang w:eastAsia="es-MX"/>
             </w:rPr>
           </w:pPr>
-          <w:hyperlink w:anchor="_Toc227795037" w:history="1">
+          <w:hyperlink w:anchor="_Toc229498352" w:history="1">
             <w:r>
               <w:rPr>
                 <w:rStyle w:val="Hipervnculo"/>
@@ -366,7 +968,7 @@
                 <w:noProof/>
                 <w:webHidden/>
               </w:rPr>
-              <w:instrText xml:space="preserve"> PAGEREF _Toc227795037 \h </w:instrText>
+              <w:instrText xml:space="preserve"> PAGEREF _Toc229498352 \h </w:instrText>
             </w:r>
             <w:r>
               <w:rPr>
@@ -386,7 +988,7 @@
                 <w:noProof/>
                 <w:webHidden/>
               </w:rPr>
-              <w:t>5</w:t>
+              <w:t>6</w:t>
             </w:r>
             <w:r>
               <w:rPr>
@@ -412,7 +1014,7 @@
               <w:lang w:eastAsia="es-MX"/>
             </w:rPr>
           </w:pPr>
-          <w:hyperlink w:anchor="_Toc227795038" w:history="1">
+          <w:hyperlink w:anchor="_Toc229498353" w:history="1">
             <w:r>
               <w:rPr>
                 <w:rStyle w:val="Hipervnculo"/>
@@ -442,7 +1044,7 @@
                 <w:noProof/>
                 <w:webHidden/>
               </w:rPr>
-              <w:instrText xml:space="preserve"> PAGEREF _Toc227795038 \h </w:instrText>
+              <w:instrText xml:space="preserve"> PAGEREF _Toc229498353 \h </w:instrText>
             </w:r>
             <w:r>
               <w:rPr>
@@ -462,7 +1064,7 @@
                 <w:noProof/>
                 <w:webHidden/>
               </w:rPr>
-              <w:t>6</w:t>
+              <w:t>8</w:t>
             </w:r>
             <w:r>
               <w:rPr>
@@ -490,7 +1092,7 @@
               <w:lang w:eastAsia="es-MX"/>
             </w:rPr>
           </w:pPr>
-          <w:hyperlink w:anchor="_Toc227795039" w:history="1">
+          <w:hyperlink w:anchor="_Toc229498354" w:history="1">
             <w:r>
               <w:rPr>
                 <w:rStyle w:val="Hipervnculo"/>
@@ -518,7 +1120,7 @@
                 <w:noProof/>
                 <w:webHidden/>
               </w:rPr>
-              <w:instrText xml:space="preserve"> PAGEREF _Toc227795039 \h </w:instrText>
+              <w:instrText xml:space="preserve"> PAGEREF _Toc229498354 \h </w:instrText>
             </w:r>
             <w:r>
               <w:rPr>
@@ -538,7 +1140,7 @@
                 <w:noProof/>
                 <w:webHidden/>
               </w:rPr>
-              <w:t>7</w:t>
+              <w:t>9</w:t>
             </w:r>
             <w:r>
               <w:rPr>
@@ -566,7 +1168,7 @@
               <w:lang w:eastAsia="es-MX"/>
             </w:rPr>
           </w:pPr>
-          <w:hyperlink w:anchor="_Toc227795040" w:history="1">
+          <w:hyperlink w:anchor="_Toc229498355" w:history="1">
             <w:r>
               <w:rPr>
                 <w:rStyle w:val="Hipervnculo"/>
@@ -594,7 +1196,7 @@
                 <w:noProof/>
                 <w:webHidden/>
               </w:rPr>
-              <w:instrText xml:space="preserve"> PAGEREF _Toc227795040 \h </w:instrText>
+              <w:instrText xml:space="preserve"> PAGEREF _Toc229498355 \h </w:instrText>
             </w:r>
             <w:r>
               <w:rPr>
@@ -614,7 +1216,7 @@
                 <w:noProof/>
                 <w:webHidden/>
               </w:rPr>
-              <w:t>8</w:t>
+              <w:t>11</w:t>
             </w:r>
             <w:r>
               <w:rPr>
@@ -642,7 +1244,7 @@
               <w:lang w:eastAsia="es-MX"/>
             </w:rPr>
           </w:pPr>
-          <w:hyperlink w:anchor="_Toc227795041" w:history="1">
+          <w:hyperlink w:anchor="_Toc229498356" w:history="1">
             <w:r>
               <w:rPr>
                 <w:rStyle w:val="Hipervnculo"/>
@@ -652,29 +1254,155 @@
                 <w:lang w:eastAsia="es-MX"/>
                 <w14:ligatures w14:val="none"/>
               </w:rPr>
-              <w:t>Vistas (Pr</w:t>
-            </w:r>
+              <w:t>Vistas (Propuesta):</w:t>
+            </w:r>
+            <w:r>
+              <w:rPr>
+                <w:noProof/>
+                <w:webHidden/>
+              </w:rPr>
+              <w:tab/>
+            </w:r>
+            <w:r>
+              <w:rPr>
+                <w:noProof/>
+                <w:webHidden/>
+              </w:rPr>
+              <w:fldChar w:fldCharType="begin"/>
+            </w:r>
+            <w:r>
+              <w:rPr>
+                <w:noProof/>
+                <w:webHidden/>
+              </w:rPr>
+              <w:instrText xml:space="preserve"> PAGEREF _Toc229498356 \h </w:instrText>
+            </w:r>
+            <w:r>
+              <w:rPr>
+                <w:noProof/>
+                <w:webHidden/>
+              </w:rPr>
+            </w:r>
+            <w:r>
+              <w:rPr>
+                <w:noProof/>
+                <w:webHidden/>
+              </w:rPr>
+              <w:fldChar w:fldCharType="separate"/>
+            </w:r>
+            <w:r>
+              <w:rPr>
+                <w:noProof/>
+                <w:webHidden/>
+              </w:rPr>
+              <w:t>12</w:t>
+            </w:r>
+            <w:r>
+              <w:rPr>
+                <w:noProof/>
+                <w:webHidden/>
+              </w:rPr>
+              <w:fldChar w:fldCharType="end"/>
+            </w:r>
+          </w:hyperlink>
+        </w:p>
+        <w:p>
+          <w:pPr>
+            <w:pStyle w:val="TDC2"/>
+            <w:tabs>
+              <w:tab w:val="right" w:leader="dot" w:pos="9350"/>
+            </w:tabs>
+            <w:rPr>
+              <w:rFonts w:eastAsiaTheme="minorEastAsia"/>
+              <w:smallCaps w:val="0"/>
+              <w:noProof/>
+              <w:sz w:val="24"/>
+              <w:szCs w:val="24"/>
+              <w:lang w:eastAsia="es-MX"/>
+            </w:rPr>
+          </w:pPr>
+          <w:hyperlink w:anchor="_Toc229498357" w:history="1">
             <w:r>
               <w:rPr>
                 <w:rStyle w:val="Hipervnculo"/>
                 <w:rFonts w:ascii="Arial" w:hAnsi="Arial" w:cs="Arial"/>
                 <w:noProof/>
-                <w:kern w:val="0"/>
-                <w:lang w:eastAsia="es-MX"/>
-                <w14:ligatures w14:val="none"/>
-              </w:rPr>
-              <w:t>o</w:t>
-            </w:r>
+              </w:rPr>
+              <w:t>1. Login</w:t>
+            </w:r>
+            <w:r>
+              <w:rPr>
+                <w:noProof/>
+                <w:webHidden/>
+              </w:rPr>
+              <w:tab/>
+            </w:r>
+            <w:r>
+              <w:rPr>
+                <w:noProof/>
+                <w:webHidden/>
+              </w:rPr>
+              <w:fldChar w:fldCharType="begin"/>
+            </w:r>
+            <w:r>
+              <w:rPr>
+                <w:noProof/>
+                <w:webHidden/>
+              </w:rPr>
+              <w:instrText xml:space="preserve"> PAGEREF _Toc229498357 \h </w:instrText>
+            </w:r>
+            <w:r>
+              <w:rPr>
+                <w:noProof/>
+                <w:webHidden/>
+              </w:rPr>
+            </w:r>
+            <w:r>
+              <w:rPr>
+                <w:noProof/>
+                <w:webHidden/>
+              </w:rPr>
+              <w:fldChar w:fldCharType="separate"/>
+            </w:r>
+            <w:r>
+              <w:rPr>
+                <w:noProof/>
+                <w:webHidden/>
+              </w:rPr>
+              <w:t>12</w:t>
+            </w:r>
+            <w:r>
+              <w:rPr>
+                <w:noProof/>
+                <w:webHidden/>
+              </w:rPr>
+              <w:fldChar w:fldCharType="end"/>
+            </w:r>
+          </w:hyperlink>
+        </w:p>
+        <w:p>
+          <w:pPr>
+            <w:pStyle w:val="TDC2"/>
+            <w:tabs>
+              <w:tab w:val="right" w:leader="dot" w:pos="9350"/>
+            </w:tabs>
+            <w:rPr>
+              <w:rFonts w:eastAsiaTheme="minorEastAsia"/>
+              <w:smallCaps w:val="0"/>
+              <w:noProof/>
+              <w:sz w:val="24"/>
+              <w:szCs w:val="24"/>
+              <w:lang w:eastAsia="es-MX"/>
+            </w:rPr>
+          </w:pPr>
+          <w:hyperlink w:anchor="_Toc229498358" w:history="1">
             <w:r>
               <w:rPr>
                 <w:rStyle w:val="Hipervnculo"/>
                 <w:rFonts w:ascii="Arial" w:hAnsi="Arial" w:cs="Arial"/>
                 <w:noProof/>
-                <w:kern w:val="0"/>
-                <w:lang w:eastAsia="es-MX"/>
-                <w14:ligatures w14:val="none"/>
-              </w:rPr>
-              <w:t>puesta):</w:t>
+              </w:rPr>
+              <w:t>2. Dashboard / inicio</w:t>
             </w:r>
             <w:r>
               <w:rPr>
@@ -695,7 +1423,7 @@
                 <w:noProof/>
                 <w:webHidden/>
               </w:rPr>
-              <w:instrText xml:space="preserve"> PAGEREF _Toc227795041 \h </w:instrText>
+              <w:instrText xml:space="preserve"> PAGEREF _Toc229498358 \h </w:instrText>
             </w:r>
             <w:r>
               <w:rPr>
@@ -715,7 +1443,709 @@
                 <w:noProof/>
                 <w:webHidden/>
               </w:rPr>
-              <w:t>9</w:t>
+              <w:t>13</w:t>
+            </w:r>
+            <w:r>
+              <w:rPr>
+                <w:noProof/>
+                <w:webHidden/>
+              </w:rPr>
+              <w:fldChar w:fldCharType="end"/>
+            </w:r>
+          </w:hyperlink>
+        </w:p>
+        <w:p>
+          <w:pPr>
+            <w:pStyle w:val="TDC2"/>
+            <w:tabs>
+              <w:tab w:val="right" w:leader="dot" w:pos="9350"/>
+            </w:tabs>
+            <w:rPr>
+              <w:rFonts w:eastAsiaTheme="minorEastAsia"/>
+              <w:smallCaps w:val="0"/>
+              <w:noProof/>
+              <w:sz w:val="24"/>
+              <w:szCs w:val="24"/>
+              <w:lang w:eastAsia="es-MX"/>
+            </w:rPr>
+          </w:pPr>
+          <w:hyperlink w:anchor="_Toc229498359" w:history="1">
+            <w:r>
+              <w:rPr>
+                <w:rStyle w:val="Hipervnculo"/>
+                <w:rFonts w:ascii="Arial" w:hAnsi="Arial" w:cs="Arial"/>
+                <w:noProof/>
+              </w:rPr>
+              <w:t>3. Lista de tutores (con búsqueda)</w:t>
+            </w:r>
+            <w:r>
+              <w:rPr>
+                <w:noProof/>
+                <w:webHidden/>
+              </w:rPr>
+              <w:tab/>
+            </w:r>
+            <w:r>
+              <w:rPr>
+                <w:noProof/>
+                <w:webHidden/>
+              </w:rPr>
+              <w:fldChar w:fldCharType="begin"/>
+            </w:r>
+            <w:r>
+              <w:rPr>
+                <w:noProof/>
+                <w:webHidden/>
+              </w:rPr>
+              <w:instrText xml:space="preserve"> PAGEREF _Toc229498359 \h </w:instrText>
+            </w:r>
+            <w:r>
+              <w:rPr>
+                <w:noProof/>
+                <w:webHidden/>
+              </w:rPr>
+            </w:r>
+            <w:r>
+              <w:rPr>
+                <w:noProof/>
+                <w:webHidden/>
+              </w:rPr>
+              <w:fldChar w:fldCharType="separate"/>
+            </w:r>
+            <w:r>
+              <w:rPr>
+                <w:noProof/>
+                <w:webHidden/>
+              </w:rPr>
+              <w:t>13</w:t>
+            </w:r>
+            <w:r>
+              <w:rPr>
+                <w:noProof/>
+                <w:webHidden/>
+              </w:rPr>
+              <w:fldChar w:fldCharType="end"/>
+            </w:r>
+          </w:hyperlink>
+        </w:p>
+        <w:p>
+          <w:pPr>
+            <w:pStyle w:val="TDC2"/>
+            <w:tabs>
+              <w:tab w:val="right" w:leader="dot" w:pos="9350"/>
+            </w:tabs>
+            <w:rPr>
+              <w:rFonts w:eastAsiaTheme="minorEastAsia"/>
+              <w:smallCaps w:val="0"/>
+              <w:noProof/>
+              <w:sz w:val="24"/>
+              <w:szCs w:val="24"/>
+              <w:lang w:eastAsia="es-MX"/>
+            </w:rPr>
+          </w:pPr>
+          <w:hyperlink w:anchor="_Toc229498360" w:history="1">
+            <w:r>
+              <w:rPr>
+                <w:rStyle w:val="Hipervnculo"/>
+                <w:rFonts w:ascii="Arial" w:hAnsi="Arial" w:cs="Arial"/>
+                <w:noProof/>
+              </w:rPr>
+              <w:t>4. Formulario — agregar / editar tutor</w:t>
+            </w:r>
+            <w:r>
+              <w:rPr>
+                <w:noProof/>
+                <w:webHidden/>
+              </w:rPr>
+              <w:tab/>
+            </w:r>
+            <w:r>
+              <w:rPr>
+                <w:noProof/>
+                <w:webHidden/>
+              </w:rPr>
+              <w:fldChar w:fldCharType="begin"/>
+            </w:r>
+            <w:r>
+              <w:rPr>
+                <w:noProof/>
+                <w:webHidden/>
+              </w:rPr>
+              <w:instrText xml:space="preserve"> PAGEREF _Toc229498360 \h </w:instrText>
+            </w:r>
+            <w:r>
+              <w:rPr>
+                <w:noProof/>
+                <w:webHidden/>
+              </w:rPr>
+            </w:r>
+            <w:r>
+              <w:rPr>
+                <w:noProof/>
+                <w:webHidden/>
+              </w:rPr>
+              <w:fldChar w:fldCharType="separate"/>
+            </w:r>
+            <w:r>
+              <w:rPr>
+                <w:noProof/>
+                <w:webHidden/>
+              </w:rPr>
+              <w:t>14</w:t>
+            </w:r>
+            <w:r>
+              <w:rPr>
+                <w:noProof/>
+                <w:webHidden/>
+              </w:rPr>
+              <w:fldChar w:fldCharType="end"/>
+            </w:r>
+          </w:hyperlink>
+        </w:p>
+        <w:p>
+          <w:pPr>
+            <w:pStyle w:val="TDC2"/>
+            <w:tabs>
+              <w:tab w:val="right" w:leader="dot" w:pos="9350"/>
+            </w:tabs>
+            <w:rPr>
+              <w:rFonts w:eastAsiaTheme="minorEastAsia"/>
+              <w:smallCaps w:val="0"/>
+              <w:noProof/>
+              <w:sz w:val="24"/>
+              <w:szCs w:val="24"/>
+              <w:lang w:eastAsia="es-MX"/>
+            </w:rPr>
+          </w:pPr>
+          <w:hyperlink w:anchor="_Toc229498361" w:history="1">
+            <w:r>
+              <w:rPr>
+                <w:rStyle w:val="Hipervnculo"/>
+                <w:rFonts w:ascii="Arial" w:hAnsi="Arial" w:cs="Arial"/>
+                <w:noProof/>
+              </w:rPr>
+              <w:t>5. Perfil / detalle del tutor</w:t>
+            </w:r>
+            <w:r>
+              <w:rPr>
+                <w:noProof/>
+                <w:webHidden/>
+              </w:rPr>
+              <w:tab/>
+            </w:r>
+            <w:r>
+              <w:rPr>
+                <w:noProof/>
+                <w:webHidden/>
+              </w:rPr>
+              <w:fldChar w:fldCharType="begin"/>
+            </w:r>
+            <w:r>
+              <w:rPr>
+                <w:noProof/>
+                <w:webHidden/>
+              </w:rPr>
+              <w:instrText xml:space="preserve"> PAGEREF _Toc229498361 \h </w:instrText>
+            </w:r>
+            <w:r>
+              <w:rPr>
+                <w:noProof/>
+                <w:webHidden/>
+              </w:rPr>
+            </w:r>
+            <w:r>
+              <w:rPr>
+                <w:noProof/>
+                <w:webHidden/>
+              </w:rPr>
+              <w:fldChar w:fldCharType="separate"/>
+            </w:r>
+            <w:r>
+              <w:rPr>
+                <w:noProof/>
+                <w:webHidden/>
+              </w:rPr>
+              <w:t>14</w:t>
+            </w:r>
+            <w:r>
+              <w:rPr>
+                <w:noProof/>
+                <w:webHidden/>
+              </w:rPr>
+              <w:fldChar w:fldCharType="end"/>
+            </w:r>
+          </w:hyperlink>
+        </w:p>
+        <w:p>
+          <w:pPr>
+            <w:pStyle w:val="TDC2"/>
+            <w:tabs>
+              <w:tab w:val="right" w:leader="dot" w:pos="9350"/>
+            </w:tabs>
+            <w:rPr>
+              <w:rFonts w:eastAsiaTheme="minorEastAsia"/>
+              <w:smallCaps w:val="0"/>
+              <w:noProof/>
+              <w:sz w:val="24"/>
+              <w:szCs w:val="24"/>
+              <w:lang w:eastAsia="es-MX"/>
+            </w:rPr>
+          </w:pPr>
+          <w:hyperlink w:anchor="_Toc229498362" w:history="1">
+            <w:r>
+              <w:rPr>
+                <w:rStyle w:val="Hipervnculo"/>
+                <w:rFonts w:ascii="Arial" w:hAnsi="Arial" w:cs="Arial"/>
+                <w:noProof/>
+              </w:rPr>
+              <w:t>6. Confirmar eliminación</w:t>
+            </w:r>
+            <w:r>
+              <w:rPr>
+                <w:noProof/>
+                <w:webHidden/>
+              </w:rPr>
+              <w:tab/>
+            </w:r>
+            <w:r>
+              <w:rPr>
+                <w:noProof/>
+                <w:webHidden/>
+              </w:rPr>
+              <w:fldChar w:fldCharType="begin"/>
+            </w:r>
+            <w:r>
+              <w:rPr>
+                <w:noProof/>
+                <w:webHidden/>
+              </w:rPr>
+              <w:instrText xml:space="preserve"> PAGEREF _Toc229498362 \h </w:instrText>
+            </w:r>
+            <w:r>
+              <w:rPr>
+                <w:noProof/>
+                <w:webHidden/>
+              </w:rPr>
+            </w:r>
+            <w:r>
+              <w:rPr>
+                <w:noProof/>
+                <w:webHidden/>
+              </w:rPr>
+              <w:fldChar w:fldCharType="separate"/>
+            </w:r>
+            <w:r>
+              <w:rPr>
+                <w:noProof/>
+                <w:webHidden/>
+              </w:rPr>
+              <w:t>15</w:t>
+            </w:r>
+            <w:r>
+              <w:rPr>
+                <w:noProof/>
+                <w:webHidden/>
+              </w:rPr>
+              <w:fldChar w:fldCharType="end"/>
+            </w:r>
+          </w:hyperlink>
+        </w:p>
+        <w:p>
+          <w:pPr>
+            <w:pStyle w:val="TDC2"/>
+            <w:tabs>
+              <w:tab w:val="right" w:leader="dot" w:pos="9350"/>
+            </w:tabs>
+            <w:rPr>
+              <w:rFonts w:eastAsiaTheme="minorEastAsia"/>
+              <w:smallCaps w:val="0"/>
+              <w:noProof/>
+              <w:sz w:val="24"/>
+              <w:szCs w:val="24"/>
+              <w:lang w:eastAsia="es-MX"/>
+            </w:rPr>
+          </w:pPr>
+          <w:hyperlink w:anchor="_Toc229498363" w:history="1">
+            <w:r>
+              <w:rPr>
+                <w:rStyle w:val="Hipervnculo"/>
+                <w:rFonts w:ascii="Arial" w:hAnsi="Arial" w:cs="Arial"/>
+                <w:noProof/>
+                <w:spacing w:val="13"/>
+              </w:rPr>
+              <w:t xml:space="preserve">7. </w:t>
+            </w:r>
+            <w:r>
+              <w:rPr>
+                <w:rStyle w:val="Hipervnculo"/>
+                <w:rFonts w:ascii="Arial" w:hAnsi="Arial" w:cs="Arial"/>
+                <w:noProof/>
+              </w:rPr>
+              <w:t>Registrar asistencia — vista del tutor</w:t>
+            </w:r>
+            <w:r>
+              <w:rPr>
+                <w:noProof/>
+                <w:webHidden/>
+              </w:rPr>
+              <w:tab/>
+            </w:r>
+            <w:r>
+              <w:rPr>
+                <w:noProof/>
+                <w:webHidden/>
+              </w:rPr>
+              <w:fldChar w:fldCharType="begin"/>
+            </w:r>
+            <w:r>
+              <w:rPr>
+                <w:noProof/>
+                <w:webHidden/>
+              </w:rPr>
+              <w:instrText xml:space="preserve"> PAGEREF _Toc229498363 \h </w:instrText>
+            </w:r>
+            <w:r>
+              <w:rPr>
+                <w:noProof/>
+                <w:webHidden/>
+              </w:rPr>
+            </w:r>
+            <w:r>
+              <w:rPr>
+                <w:noProof/>
+                <w:webHidden/>
+              </w:rPr>
+              <w:fldChar w:fldCharType="separate"/>
+            </w:r>
+            <w:r>
+              <w:rPr>
+                <w:noProof/>
+                <w:webHidden/>
+              </w:rPr>
+              <w:t>15</w:t>
+            </w:r>
+            <w:r>
+              <w:rPr>
+                <w:noProof/>
+                <w:webHidden/>
+              </w:rPr>
+              <w:fldChar w:fldCharType="end"/>
+            </w:r>
+          </w:hyperlink>
+        </w:p>
+        <w:p>
+          <w:pPr>
+            <w:pStyle w:val="TDC2"/>
+            <w:tabs>
+              <w:tab w:val="right" w:leader="dot" w:pos="9350"/>
+            </w:tabs>
+            <w:rPr>
+              <w:rFonts w:eastAsiaTheme="minorEastAsia"/>
+              <w:smallCaps w:val="0"/>
+              <w:noProof/>
+              <w:sz w:val="24"/>
+              <w:szCs w:val="24"/>
+              <w:lang w:eastAsia="es-MX"/>
+            </w:rPr>
+          </w:pPr>
+          <w:hyperlink w:anchor="_Toc229498364" w:history="1">
+            <w:r>
+              <w:rPr>
+                <w:rStyle w:val="Hipervnculo"/>
+                <w:rFonts w:ascii="Arial" w:hAnsi="Arial" w:cs="Arial"/>
+                <w:noProof/>
+              </w:rPr>
+              <w:t>8. Resumen de asistencia — cálculo del 80%</w:t>
+            </w:r>
+            <w:r>
+              <w:rPr>
+                <w:noProof/>
+                <w:webHidden/>
+              </w:rPr>
+              <w:tab/>
+            </w:r>
+            <w:r>
+              <w:rPr>
+                <w:noProof/>
+                <w:webHidden/>
+              </w:rPr>
+              <w:fldChar w:fldCharType="begin"/>
+            </w:r>
+            <w:r>
+              <w:rPr>
+                <w:noProof/>
+                <w:webHidden/>
+              </w:rPr>
+              <w:instrText xml:space="preserve"> PAGEREF _Toc229498364 \h </w:instrText>
+            </w:r>
+            <w:r>
+              <w:rPr>
+                <w:noProof/>
+                <w:webHidden/>
+              </w:rPr>
+            </w:r>
+            <w:r>
+              <w:rPr>
+                <w:noProof/>
+                <w:webHidden/>
+              </w:rPr>
+              <w:fldChar w:fldCharType="separate"/>
+            </w:r>
+            <w:r>
+              <w:rPr>
+                <w:noProof/>
+                <w:webHidden/>
+              </w:rPr>
+              <w:t>16</w:t>
+            </w:r>
+            <w:r>
+              <w:rPr>
+                <w:noProof/>
+                <w:webHidden/>
+              </w:rPr>
+              <w:fldChar w:fldCharType="end"/>
+            </w:r>
+          </w:hyperlink>
+        </w:p>
+        <w:p>
+          <w:pPr>
+            <w:pStyle w:val="TDC2"/>
+            <w:tabs>
+              <w:tab w:val="right" w:leader="dot" w:pos="9350"/>
+            </w:tabs>
+            <w:rPr>
+              <w:rFonts w:eastAsiaTheme="minorEastAsia"/>
+              <w:smallCaps w:val="0"/>
+              <w:noProof/>
+              <w:sz w:val="24"/>
+              <w:szCs w:val="24"/>
+              <w:lang w:eastAsia="es-MX"/>
+            </w:rPr>
+          </w:pPr>
+          <w:hyperlink w:anchor="_Toc229498365" w:history="1">
+            <w:r>
+              <w:rPr>
+                <w:rStyle w:val="Hipervnculo"/>
+                <w:rFonts w:ascii="Arial" w:hAnsi="Arial" w:cs="Arial"/>
+                <w:noProof/>
+                <w:spacing w:val="13"/>
+              </w:rPr>
+              <w:t xml:space="preserve">9. </w:t>
+            </w:r>
+            <w:r>
+              <w:rPr>
+                <w:rStyle w:val="Hipervnculo"/>
+                <w:rFonts w:ascii="Arial" w:hAnsi="Arial" w:cs="Arial"/>
+                <w:noProof/>
+              </w:rPr>
+              <w:t>Detección de necesidades — formulario</w:t>
+            </w:r>
+            <w:r>
+              <w:rPr>
+                <w:noProof/>
+                <w:webHidden/>
+              </w:rPr>
+              <w:tab/>
+            </w:r>
+            <w:r>
+              <w:rPr>
+                <w:noProof/>
+                <w:webHidden/>
+              </w:rPr>
+              <w:fldChar w:fldCharType="begin"/>
+            </w:r>
+            <w:r>
+              <w:rPr>
+                <w:noProof/>
+                <w:webHidden/>
+              </w:rPr>
+              <w:instrText xml:space="preserve"> PAGEREF _Toc229498365 \h </w:instrText>
+            </w:r>
+            <w:r>
+              <w:rPr>
+                <w:noProof/>
+                <w:webHidden/>
+              </w:rPr>
+            </w:r>
+            <w:r>
+              <w:rPr>
+                <w:noProof/>
+                <w:webHidden/>
+              </w:rPr>
+              <w:fldChar w:fldCharType="separate"/>
+            </w:r>
+            <w:r>
+              <w:rPr>
+                <w:noProof/>
+                <w:webHidden/>
+              </w:rPr>
+              <w:t>16</w:t>
+            </w:r>
+            <w:r>
+              <w:rPr>
+                <w:noProof/>
+                <w:webHidden/>
+              </w:rPr>
+              <w:fldChar w:fldCharType="end"/>
+            </w:r>
+          </w:hyperlink>
+        </w:p>
+        <w:p>
+          <w:pPr>
+            <w:pStyle w:val="TDC2"/>
+            <w:tabs>
+              <w:tab w:val="right" w:leader="dot" w:pos="9350"/>
+            </w:tabs>
+            <w:rPr>
+              <w:rFonts w:eastAsiaTheme="minorEastAsia"/>
+              <w:smallCaps w:val="0"/>
+              <w:noProof/>
+              <w:sz w:val="24"/>
+              <w:szCs w:val="24"/>
+              <w:lang w:eastAsia="es-MX"/>
+            </w:rPr>
+          </w:pPr>
+          <w:hyperlink w:anchor="_Toc229498366" w:history="1">
+            <w:r>
+              <w:rPr>
+                <w:rStyle w:val="Hipervnculo"/>
+                <w:rFonts w:ascii="Arial" w:hAnsi="Arial" w:cs="Arial"/>
+                <w:noProof/>
+                <w:spacing w:val="13"/>
+              </w:rPr>
+              <w:t xml:space="preserve">10. </w:t>
+            </w:r>
+            <w:r>
+              <w:rPr>
+                <w:rStyle w:val="Hipervnculo"/>
+                <w:rFonts w:ascii="Arial" w:hAnsi="Arial" w:cs="Arial"/>
+                <w:noProof/>
+              </w:rPr>
+              <w:t>Reporte de sesión — Anexo 19</w:t>
+            </w:r>
+            <w:r>
+              <w:rPr>
+                <w:noProof/>
+                <w:webHidden/>
+              </w:rPr>
+              <w:tab/>
+            </w:r>
+            <w:r>
+              <w:rPr>
+                <w:noProof/>
+                <w:webHidden/>
+              </w:rPr>
+              <w:fldChar w:fldCharType="begin"/>
+            </w:r>
+            <w:r>
+              <w:rPr>
+                <w:noProof/>
+                <w:webHidden/>
+              </w:rPr>
+              <w:instrText xml:space="preserve"> PAGEREF _Toc229498366 \h </w:instrText>
+            </w:r>
+            <w:r>
+              <w:rPr>
+                <w:noProof/>
+                <w:webHidden/>
+              </w:rPr>
+            </w:r>
+            <w:r>
+              <w:rPr>
+                <w:noProof/>
+                <w:webHidden/>
+              </w:rPr>
+              <w:fldChar w:fldCharType="separate"/>
+            </w:r>
+            <w:r>
+              <w:rPr>
+                <w:noProof/>
+                <w:webHidden/>
+              </w:rPr>
+              <w:t>17</w:t>
+            </w:r>
+            <w:r>
+              <w:rPr>
+                <w:noProof/>
+                <w:webHidden/>
+              </w:rPr>
+              <w:fldChar w:fldCharType="end"/>
+            </w:r>
+          </w:hyperlink>
+        </w:p>
+        <w:p>
+          <w:pPr>
+            <w:pStyle w:val="TDC2"/>
+            <w:tabs>
+              <w:tab w:val="right" w:leader="dot" w:pos="9350"/>
+            </w:tabs>
+            <w:rPr>
+              <w:rFonts w:eastAsiaTheme="minorEastAsia"/>
+              <w:smallCaps w:val="0"/>
+              <w:noProof/>
+              <w:sz w:val="24"/>
+              <w:szCs w:val="24"/>
+              <w:lang w:eastAsia="es-MX"/>
+            </w:rPr>
+          </w:pPr>
+          <w:hyperlink w:anchor="_Toc229498367" w:history="1">
+            <w:r>
+              <w:rPr>
+                <w:rStyle w:val="Hipervnculo"/>
+                <w:rFonts w:ascii="Arial" w:hAnsi="Arial" w:cs="Arial"/>
+                <w:noProof/>
+                <w:spacing w:val="13"/>
+              </w:rPr>
+              <w:t xml:space="preserve">11. </w:t>
+            </w:r>
+            <w:r>
+              <w:rPr>
+                <w:rStyle w:val="Hipervnculo"/>
+                <w:rFonts w:ascii="Arial" w:hAnsi="Arial" w:cs="Arial"/>
+                <w:noProof/>
+              </w:rPr>
+              <w:t>Evidencias de sesión — validación</w:t>
+            </w:r>
+            <w:r>
+              <w:rPr>
+                <w:noProof/>
+                <w:webHidden/>
+              </w:rPr>
+              <w:tab/>
+            </w:r>
+            <w:r>
+              <w:rPr>
+                <w:noProof/>
+                <w:webHidden/>
+              </w:rPr>
+              <w:fldChar w:fldCharType="begin"/>
+            </w:r>
+            <w:r>
+              <w:rPr>
+                <w:noProof/>
+                <w:webHidden/>
+              </w:rPr>
+              <w:instrText xml:space="preserve"> PAGEREF _Toc229498367 \h </w:instrText>
+            </w:r>
+            <w:r>
+              <w:rPr>
+                <w:noProof/>
+                <w:webHidden/>
+              </w:rPr>
+            </w:r>
+            <w:r>
+              <w:rPr>
+                <w:noProof/>
+                <w:webHidden/>
+              </w:rPr>
+              <w:fldChar w:fldCharType="separate"/>
+            </w:r>
+            <w:r>
+              <w:rPr>
+                <w:noProof/>
+                <w:webHidden/>
+              </w:rPr>
+              <w:t>17</w:t>
             </w:r>
             <w:r>
               <w:rPr>
@@ -743,7 +2173,7 @@
               <w:lang w:eastAsia="es-MX"/>
             </w:rPr>
           </w:pPr>
-          <w:hyperlink w:anchor="_Toc227795042" w:history="1">
+          <w:hyperlink w:anchor="_Toc229498368" w:history="1">
             <w:r>
               <w:rPr>
                 <w:rStyle w:val="Hipervnculo"/>
@@ -771,7 +2201,7 @@
                 <w:noProof/>
                 <w:webHidden/>
               </w:rPr>
-              <w:instrText xml:space="preserve"> PAGEREF _Toc227795042 \h </w:instrText>
+              <w:instrText xml:space="preserve"> PAGEREF _Toc229498368 \h </w:instrText>
             </w:r>
             <w:r>
               <w:rPr>
@@ -791,7 +2221,7 @@
                 <w:noProof/>
                 <w:webHidden/>
               </w:rPr>
-              <w:t>15</w:t>
+              <w:t>18</w:t>
             </w:r>
             <w:r>
               <w:rPr>
@@ -803,8 +2233,15 @@
           </w:hyperlink>
         </w:p>
         <w:p>
+          <w:pPr>
+            <w:spacing w:line="360" w:lineRule="auto"/>
+            <w:rPr>
+              <w:rFonts w:ascii="Arial" w:hAnsi="Arial" w:cs="Arial"/>
+            </w:rPr>
+          </w:pPr>
           <w:r>
             <w:rPr>
+              <w:rFonts w:ascii="Arial" w:hAnsi="Arial" w:cs="Arial"/>
               <w:b/>
               <w:bCs/>
               <w:noProof/>
@@ -816,6 +2253,7 @@
     </w:sdt>
     <w:p>
       <w:pPr>
+        <w:spacing w:line="360" w:lineRule="auto"/>
         <w:rPr>
           <w:rFonts w:ascii="Arial" w:eastAsiaTheme="majorEastAsia" w:hAnsi="Arial" w:cs="Arial"/>
           <w:b/>
@@ -839,21 +2277,24 @@
     <w:p>
       <w:pPr>
         <w:pStyle w:val="Ttulo1"/>
+        <w:spacing w:line="360" w:lineRule="auto"/>
         <w:jc w:val="center"/>
         <w:rPr>
           <w:rFonts w:ascii="Arial" w:hAnsi="Arial" w:cs="Arial"/>
           <w:b/>
           <w:bCs/>
+          <w:color w:val="000000" w:themeColor="text1"/>
           <w:sz w:val="36"/>
           <w:szCs w:val="36"/>
         </w:rPr>
       </w:pPr>
-      <w:bookmarkStart w:id="0" w:name="_Toc227795035"/>
+      <w:bookmarkStart w:id="0" w:name="_Toc229498343"/>
       <w:r>
         <w:rPr>
           <w:rFonts w:ascii="Arial" w:hAnsi="Arial" w:cs="Arial"/>
           <w:b/>
           <w:bCs/>
+          <w:color w:val="000000" w:themeColor="text1"/>
           <w:sz w:val="36"/>
           <w:szCs w:val="36"/>
         </w:rPr>
@@ -864,6 +2305,7 @@
     </w:p>
     <w:p>
       <w:pPr>
+        <w:spacing w:line="360" w:lineRule="auto"/>
         <w:jc w:val="both"/>
         <w:rPr>
           <w:rFonts w:ascii="Arial" w:hAnsi="Arial" w:cs="Arial"/>
@@ -892,6 +2334,7 @@
     </w:p>
     <w:p>
       <w:pPr>
+        <w:spacing w:line="360" w:lineRule="auto"/>
         <w:jc w:val="both"/>
         <w:rPr>
           <w:rFonts w:ascii="Arial" w:hAnsi="Arial" w:cs="Arial"/>
@@ -920,30 +2363,31 @@
     </w:p>
     <w:p>
       <w:pPr>
+        <w:pStyle w:val="Ttulo2"/>
         <w:jc w:val="center"/>
         <w:rPr>
           <w:rFonts w:ascii="Arial" w:hAnsi="Arial" w:cs="Arial"/>
           <w:b/>
           <w:bCs/>
-          <w:sz w:val="28"/>
-          <w:szCs w:val="28"/>
-        </w:rPr>
-      </w:pPr>
+          <w:color w:val="000000" w:themeColor="text1"/>
+        </w:rPr>
+      </w:pPr>
+      <w:bookmarkStart w:id="1" w:name="_Toc229498344"/>
       <w:r>
         <w:rPr>
           <w:rFonts w:ascii="Arial" w:hAnsi="Arial" w:cs="Arial"/>
           <w:b/>
           <w:bCs/>
-          <w:sz w:val="28"/>
-          <w:szCs w:val="28"/>
+          <w:color w:val="000000" w:themeColor="text1"/>
         </w:rPr>
         <w:t>Estructura Organizacional y Actores Clave</w:t>
       </w:r>
+      <w:bookmarkEnd w:id="1"/>
     </w:p>
     <w:p>
       <w:pPr>
         <w:pStyle w:val="Textoindependiente"/>
-        <w:spacing w:before="220" w:line="292" w:lineRule="auto"/>
+        <w:spacing w:before="220" w:line="360" w:lineRule="auto"/>
         <w:ind w:left="0" w:right="221"/>
         <w:jc w:val="both"/>
         <w:rPr>
@@ -1255,19 +2699,37 @@
     </w:p>
     <w:p>
       <w:pPr>
+        <w:spacing w:line="360" w:lineRule="auto"/>
         <w:jc w:val="center"/>
         <w:rPr>
           <w:rFonts w:ascii="Arial" w:hAnsi="Arial" w:cs="Arial"/>
-        </w:rPr>
-      </w:pPr>
-      <w:r>
-        <w:rPr>
-          <w:rFonts w:ascii="Arial" w:hAnsi="Arial" w:cs="Arial"/>
           <w:b/>
           <w:bCs/>
         </w:rPr>
+      </w:pPr>
+    </w:p>
+    <w:p>
+      <w:pPr>
+        <w:pStyle w:val="Ttulo3"/>
+        <w:jc w:val="center"/>
+        <w:rPr>
+          <w:rFonts w:ascii="Arial" w:hAnsi="Arial" w:cs="Arial"/>
+          <w:b/>
+          <w:bCs/>
+          <w:color w:val="000000" w:themeColor="text1"/>
+        </w:rPr>
+      </w:pPr>
+      <w:bookmarkStart w:id="2" w:name="_Toc229498345"/>
+      <w:r>
+        <w:rPr>
+          <w:rFonts w:ascii="Arial" w:hAnsi="Arial" w:cs="Arial"/>
+          <w:b/>
+          <w:bCs/>
+          <w:color w:val="000000" w:themeColor="text1"/>
+        </w:rPr>
         <w:t>Jerarquía de Coordinación</w:t>
       </w:r>
+      <w:bookmarkEnd w:id="2"/>
     </w:p>
     <w:p>
       <w:pPr>
@@ -1279,7 +2741,7 @@
         </w:numPr>
         <w:autoSpaceDE w:val="0"/>
         <w:autoSpaceDN w:val="0"/>
-        <w:spacing w:before="220" w:after="0" w:line="290" w:lineRule="auto"/>
+        <w:spacing w:before="220" w:after="0" w:line="360" w:lineRule="auto"/>
         <w:ind w:left="426" w:right="885"/>
         <w:contextualSpacing w:val="0"/>
         <w:jc w:val="both"/>
@@ -1474,7 +2936,7 @@
         </w:tabs>
         <w:autoSpaceDE w:val="0"/>
         <w:autoSpaceDN w:val="0"/>
-        <w:spacing w:before="164" w:after="0" w:line="292" w:lineRule="auto"/>
+        <w:spacing w:before="164" w:after="0" w:line="360" w:lineRule="auto"/>
         <w:ind w:left="426" w:right="691"/>
         <w:contextualSpacing w:val="0"/>
         <w:jc w:val="both"/>
@@ -1784,7 +3246,7 @@
         </w:tabs>
         <w:autoSpaceDE w:val="0"/>
         <w:autoSpaceDN w:val="0"/>
-        <w:spacing w:before="159" w:after="0" w:line="292" w:lineRule="auto"/>
+        <w:spacing w:before="159" w:after="0" w:line="360" w:lineRule="auto"/>
         <w:ind w:left="426" w:right="341"/>
         <w:contextualSpacing w:val="0"/>
         <w:jc w:val="both"/>
@@ -2003,7 +3465,7 @@
         </w:tabs>
         <w:autoSpaceDE w:val="0"/>
         <w:autoSpaceDN w:val="0"/>
-        <w:spacing w:before="214" w:after="0" w:line="290" w:lineRule="auto"/>
+        <w:spacing w:before="214" w:after="0" w:line="360" w:lineRule="auto"/>
         <w:ind w:left="426" w:right="756"/>
         <w:contextualSpacing w:val="0"/>
         <w:jc w:val="both"/>
@@ -2316,7 +3778,7 @@
         </w:tabs>
         <w:autoSpaceDE w:val="0"/>
         <w:autoSpaceDN w:val="0"/>
-        <w:spacing w:before="214" w:after="0" w:line="290" w:lineRule="auto"/>
+        <w:spacing w:before="214" w:after="0" w:line="360" w:lineRule="auto"/>
         <w:ind w:left="426" w:right="756"/>
         <w:contextualSpacing w:val="0"/>
         <w:jc w:val="both"/>
@@ -2359,7 +3821,7 @@
     </w:p>
     <w:p>
       <w:pPr>
-        <w:jc w:val="center"/>
+        <w:spacing w:after="160" w:line="278" w:lineRule="auto"/>
         <w:rPr>
           <w:rFonts w:ascii="Arial" w:hAnsi="Arial" w:cs="Arial"/>
           <w:b/>
@@ -2376,8 +3838,32 @@
           <w:sz w:val="28"/>
           <w:szCs w:val="28"/>
         </w:rPr>
+        <w:br w:type="page"/>
+      </w:r>
+    </w:p>
+    <w:p>
+      <w:pPr>
+        <w:pStyle w:val="Ttulo3"/>
+        <w:jc w:val="center"/>
+        <w:rPr>
+          <w:rFonts w:ascii="Arial" w:hAnsi="Arial" w:cs="Arial"/>
+          <w:b/>
+          <w:bCs/>
+          <w:color w:val="000000" w:themeColor="text1"/>
+        </w:rPr>
+      </w:pPr>
+      <w:bookmarkStart w:id="3" w:name="_Toc229498346"/>
+      <w:r>
+        <w:rPr>
+          <w:rFonts w:ascii="Arial" w:hAnsi="Arial" w:cs="Arial"/>
+          <w:b/>
+          <w:bCs/>
+          <w:color w:val="000000" w:themeColor="text1"/>
+        </w:rPr>
+        <w:lastRenderedPageBreak/>
         <w:t>Roles Operativos</w:t>
       </w:r>
+      <w:bookmarkEnd w:id="3"/>
     </w:p>
     <w:p>
       <w:pPr>
@@ -2389,7 +3875,7 @@
         </w:numPr>
         <w:autoSpaceDE w:val="0"/>
         <w:autoSpaceDN w:val="0"/>
-        <w:spacing w:before="222" w:after="0" w:line="292" w:lineRule="auto"/>
+        <w:spacing w:before="222" w:after="0" w:line="360" w:lineRule="auto"/>
         <w:ind w:left="426" w:right="556"/>
         <w:contextualSpacing w:val="0"/>
         <w:jc w:val="both"/>
@@ -2839,7 +4325,7 @@
         </w:numPr>
         <w:autoSpaceDE w:val="0"/>
         <w:autoSpaceDN w:val="0"/>
-        <w:spacing w:before="157" w:after="0" w:line="240" w:lineRule="auto"/>
+        <w:spacing w:before="157" w:after="0" w:line="360" w:lineRule="auto"/>
         <w:ind w:left="426"/>
         <w:contextualSpacing w:val="0"/>
         <w:jc w:val="both"/>
@@ -2974,7 +4460,7 @@
     <w:p>
       <w:pPr>
         <w:pStyle w:val="Textoindependiente"/>
-        <w:spacing w:before="62" w:line="290" w:lineRule="auto"/>
+        <w:spacing w:before="62" w:line="360" w:lineRule="auto"/>
         <w:ind w:left="426" w:right="331"/>
         <w:jc w:val="both"/>
         <w:rPr>
@@ -3216,6 +4702,7 @@
     </w:p>
     <w:p>
       <w:pPr>
+        <w:spacing w:line="360" w:lineRule="auto"/>
         <w:rPr>
           <w:rFonts w:ascii="Arial" w:hAnsi="Arial" w:cs="Arial"/>
           <w:b/>
@@ -3227,30 +4714,31 @@
     </w:p>
     <w:p>
       <w:pPr>
+        <w:pStyle w:val="Ttulo2"/>
         <w:jc w:val="center"/>
         <w:rPr>
           <w:rFonts w:ascii="Arial" w:hAnsi="Arial" w:cs="Arial"/>
           <w:b/>
           <w:bCs/>
-          <w:sz w:val="28"/>
-          <w:szCs w:val="28"/>
-        </w:rPr>
-      </w:pPr>
+          <w:color w:val="000000" w:themeColor="text1"/>
+        </w:rPr>
+      </w:pPr>
+      <w:bookmarkStart w:id="4" w:name="_Toc229498347"/>
       <w:r>
         <w:rPr>
           <w:rFonts w:ascii="Arial" w:hAnsi="Arial" w:cs="Arial"/>
           <w:b/>
           <w:bCs/>
-          <w:sz w:val="28"/>
-          <w:szCs w:val="28"/>
+          <w:color w:val="000000" w:themeColor="text1"/>
         </w:rPr>
         <w:t>Proceso Operativo y Flujo de Trabajo</w:t>
       </w:r>
+      <w:bookmarkEnd w:id="4"/>
     </w:p>
     <w:p>
       <w:pPr>
         <w:pStyle w:val="Textoindependiente"/>
-        <w:spacing w:line="292" w:lineRule="auto"/>
+        <w:spacing w:line="360" w:lineRule="auto"/>
         <w:ind w:right="221"/>
         <w:jc w:val="both"/>
         <w:rPr>
@@ -3495,7 +4983,7 @@
     <w:p>
       <w:pPr>
         <w:pStyle w:val="Textoindependiente"/>
-        <w:spacing w:line="292" w:lineRule="auto"/>
+        <w:spacing w:line="360" w:lineRule="auto"/>
         <w:ind w:right="221"/>
         <w:jc w:val="both"/>
         <w:rPr>
@@ -3505,30 +4993,31 @@
     </w:p>
     <w:p>
       <w:pPr>
+        <w:pStyle w:val="Ttulo2"/>
         <w:jc w:val="center"/>
         <w:rPr>
           <w:rFonts w:ascii="Arial" w:hAnsi="Arial" w:cs="Arial"/>
           <w:b/>
           <w:bCs/>
-          <w:sz w:val="28"/>
-          <w:szCs w:val="28"/>
-        </w:rPr>
-      </w:pPr>
+          <w:color w:val="000000" w:themeColor="text1"/>
+        </w:rPr>
+      </w:pPr>
+      <w:bookmarkStart w:id="5" w:name="_Toc229498348"/>
       <w:r>
         <w:rPr>
           <w:rFonts w:ascii="Arial" w:hAnsi="Arial" w:cs="Arial"/>
           <w:b/>
           <w:bCs/>
-          <w:sz w:val="28"/>
-          <w:szCs w:val="28"/>
+          <w:color w:val="000000" w:themeColor="text1"/>
         </w:rPr>
         <w:t>Planeación y Asignación</w:t>
       </w:r>
+      <w:bookmarkEnd w:id="5"/>
     </w:p>
     <w:p>
       <w:pPr>
         <w:pStyle w:val="Textoindependiente"/>
-        <w:spacing w:line="290" w:lineRule="auto"/>
+        <w:spacing w:line="360" w:lineRule="auto"/>
         <w:ind w:right="319"/>
         <w:jc w:val="both"/>
         <w:rPr>
@@ -3890,7 +5379,7 @@
     <w:p>
       <w:pPr>
         <w:pStyle w:val="Textoindependiente"/>
-        <w:spacing w:before="5"/>
+        <w:spacing w:before="5" w:line="360" w:lineRule="auto"/>
         <w:jc w:val="both"/>
         <w:rPr>
           <w:rFonts w:ascii="Arial" w:hAnsi="Arial" w:cs="Arial"/>
@@ -3917,7 +5406,7 @@
         </w:tabs>
         <w:autoSpaceDE w:val="0"/>
         <w:autoSpaceDN w:val="0"/>
-        <w:spacing w:before="220" w:after="0" w:line="240" w:lineRule="auto"/>
+        <w:spacing w:before="220" w:after="0" w:line="360" w:lineRule="auto"/>
         <w:ind w:left="981"/>
         <w:contextualSpacing w:val="0"/>
         <w:jc w:val="both"/>
@@ -3988,7 +5477,7 @@
         </w:tabs>
         <w:autoSpaceDE w:val="0"/>
         <w:autoSpaceDN w:val="0"/>
-        <w:spacing w:before="221" w:after="0" w:line="240" w:lineRule="auto"/>
+        <w:spacing w:before="221" w:after="0" w:line="360" w:lineRule="auto"/>
         <w:ind w:left="981"/>
         <w:contextualSpacing w:val="0"/>
         <w:jc w:val="both"/>
@@ -4129,7 +5618,7 @@
         </w:tabs>
         <w:autoSpaceDE w:val="0"/>
         <w:autoSpaceDN w:val="0"/>
-        <w:spacing w:before="221" w:after="0" w:line="240" w:lineRule="auto"/>
+        <w:spacing w:before="221" w:after="0" w:line="360" w:lineRule="auto"/>
         <w:ind w:left="981"/>
         <w:contextualSpacing w:val="0"/>
         <w:jc w:val="both"/>
@@ -4279,7 +5768,7 @@
         </w:tabs>
         <w:autoSpaceDE w:val="0"/>
         <w:autoSpaceDN w:val="0"/>
-        <w:spacing w:before="221"/>
+        <w:spacing w:before="221" w:line="360" w:lineRule="auto"/>
         <w:jc w:val="both"/>
         <w:rPr>
           <w:rFonts w:ascii="Arial" w:hAnsi="Arial" w:cs="Arial"/>
@@ -4288,7 +5777,7 @@
     </w:p>
     <w:p>
       <w:pPr>
-        <w:jc w:val="center"/>
+        <w:spacing w:after="160" w:line="278" w:lineRule="auto"/>
         <w:rPr>
           <w:rFonts w:ascii="Arial" w:hAnsi="Arial" w:cs="Arial"/>
           <w:b/>
@@ -4305,13 +5794,37 @@
           <w:sz w:val="28"/>
           <w:szCs w:val="28"/>
         </w:rPr>
-        <w:t>El Plan de Acción Tutorial (PAT)</w:t>
+        <w:br w:type="page"/>
       </w:r>
     </w:p>
     <w:p>
       <w:pPr>
+        <w:pStyle w:val="Ttulo2"/>
+        <w:jc w:val="center"/>
+        <w:rPr>
+          <w:rFonts w:ascii="Arial" w:hAnsi="Arial" w:cs="Arial"/>
+          <w:b/>
+          <w:bCs/>
+          <w:color w:val="000000" w:themeColor="text1"/>
+        </w:rPr>
+      </w:pPr>
+      <w:bookmarkStart w:id="6" w:name="_Toc229498349"/>
+      <w:r>
+        <w:rPr>
+          <w:rFonts w:ascii="Arial" w:hAnsi="Arial" w:cs="Arial"/>
+          <w:b/>
+          <w:bCs/>
+          <w:color w:val="000000" w:themeColor="text1"/>
+        </w:rPr>
+        <w:lastRenderedPageBreak/>
+        <w:t>El Plan de Acción Tutorial (PAT)</w:t>
+      </w:r>
+      <w:bookmarkEnd w:id="6"/>
+    </w:p>
+    <w:p>
+      <w:pPr>
         <w:pStyle w:val="Textoindependiente"/>
-        <w:spacing w:before="220" w:line="290" w:lineRule="auto"/>
+        <w:spacing w:before="220" w:line="360" w:lineRule="auto"/>
         <w:ind w:right="221"/>
         <w:jc w:val="both"/>
         <w:rPr>
@@ -4674,7 +6187,7 @@
     <w:p>
       <w:pPr>
         <w:pStyle w:val="Textoindependiente"/>
-        <w:spacing w:before="5" w:line="290" w:lineRule="auto"/>
+        <w:spacing w:before="5" w:line="360" w:lineRule="auto"/>
         <w:ind w:right="221"/>
         <w:jc w:val="both"/>
         <w:rPr>
@@ -4903,25 +6416,26 @@
     </w:p>
     <w:p>
       <w:pPr>
+        <w:pStyle w:val="Ttulo3"/>
         <w:jc w:val="center"/>
         <w:rPr>
           <w:rFonts w:ascii="Arial" w:hAnsi="Arial" w:cs="Arial"/>
           <w:b/>
           <w:bCs/>
-          <w:sz w:val="28"/>
-          <w:szCs w:val="28"/>
-        </w:rPr>
-      </w:pPr>
+          <w:color w:val="000000" w:themeColor="text1"/>
+        </w:rPr>
+      </w:pPr>
+      <w:bookmarkStart w:id="7" w:name="_Toc229498350"/>
       <w:r>
         <w:rPr>
           <w:rFonts w:ascii="Arial" w:hAnsi="Arial" w:cs="Arial"/>
           <w:b/>
           <w:bCs/>
-          <w:sz w:val="28"/>
-          <w:szCs w:val="28"/>
+          <w:color w:val="000000" w:themeColor="text1"/>
         </w:rPr>
         <w:t>Implementación Semestral</w:t>
       </w:r>
+      <w:bookmarkEnd w:id="7"/>
     </w:p>
     <w:p>
       <w:pPr>
@@ -4933,7 +6447,7 @@
         </w:numPr>
         <w:autoSpaceDE w:val="0"/>
         <w:autoSpaceDN w:val="0"/>
-        <w:spacing w:before="76" w:after="0" w:line="292" w:lineRule="auto"/>
+        <w:spacing w:before="76" w:after="0" w:line="360" w:lineRule="auto"/>
         <w:ind w:left="981" w:right="310"/>
         <w:contextualSpacing w:val="0"/>
         <w:jc w:val="both"/>
@@ -5299,7 +6813,7 @@
         </w:numPr>
         <w:autoSpaceDE w:val="0"/>
         <w:autoSpaceDN w:val="0"/>
-        <w:spacing w:before="159" w:after="0" w:line="240" w:lineRule="auto"/>
+        <w:spacing w:before="159" w:after="0" w:line="360" w:lineRule="auto"/>
         <w:ind w:left="980" w:hanging="359"/>
         <w:contextualSpacing w:val="0"/>
         <w:jc w:val="both"/>
@@ -5454,7 +6968,7 @@
     <w:p>
       <w:pPr>
         <w:pStyle w:val="Textoindependiente"/>
-        <w:spacing w:before="62" w:line="290" w:lineRule="auto"/>
+        <w:spacing w:before="62" w:line="360" w:lineRule="auto"/>
         <w:ind w:left="981" w:right="221"/>
         <w:jc w:val="both"/>
         <w:rPr>
@@ -5724,7 +7238,7 @@
         </w:numPr>
         <w:autoSpaceDE w:val="0"/>
         <w:autoSpaceDN w:val="0"/>
-        <w:spacing w:before="167" w:after="0" w:line="292" w:lineRule="auto"/>
+        <w:spacing w:before="167" w:after="0" w:line="360" w:lineRule="auto"/>
         <w:ind w:left="981" w:right="619"/>
         <w:contextualSpacing w:val="0"/>
         <w:jc w:val="both"/>
@@ -6002,6 +7516,7 @@
     </w:p>
     <w:p>
       <w:pPr>
+        <w:spacing w:line="360" w:lineRule="auto"/>
         <w:jc w:val="both"/>
         <w:rPr>
           <w:rFonts w:ascii="Arial" w:hAnsi="Arial" w:cs="Arial"/>
@@ -6010,6 +7525,7 @@
     </w:p>
     <w:p>
       <w:pPr>
+        <w:spacing w:line="360" w:lineRule="auto"/>
         <w:rPr>
           <w:rFonts w:ascii="Arial" w:hAnsi="Arial" w:cs="Arial"/>
           <w:b/>
@@ -6033,19 +7549,21 @@
           <w:rFonts w:ascii="Arial" w:hAnsi="Arial" w:cs="Arial"/>
           <w:b/>
           <w:bCs/>
-        </w:rPr>
-      </w:pPr>
-      <w:bookmarkStart w:id="1" w:name="_Toc227795036"/>
+          <w:color w:val="000000" w:themeColor="text1"/>
+        </w:rPr>
+      </w:pPr>
+      <w:bookmarkStart w:id="8" w:name="_Toc229498351"/>
       <w:r>
         <w:rPr>
           <w:rFonts w:ascii="Arial" w:hAnsi="Arial" w:cs="Arial"/>
           <w:b/>
           <w:bCs/>
+          <w:color w:val="000000" w:themeColor="text1"/>
         </w:rPr>
         <w:lastRenderedPageBreak/>
         <w:t>Requisitos del Sistema</w:t>
       </w:r>
-      <w:bookmarkEnd w:id="1"/>
+      <w:bookmarkEnd w:id="8"/>
     </w:p>
     <w:p>
       <w:pPr>
@@ -6054,22 +7572,20 @@
           <w:rFonts w:ascii="Arial" w:hAnsi="Arial" w:cs="Arial"/>
           <w:b/>
           <w:bCs/>
-          <w:sz w:val="28"/>
-          <w:szCs w:val="28"/>
-        </w:rPr>
-      </w:pPr>
-      <w:bookmarkStart w:id="2" w:name="_Toc227795037"/>
+          <w:color w:val="000000" w:themeColor="text1"/>
+        </w:rPr>
+      </w:pPr>
+      <w:bookmarkStart w:id="9" w:name="_Toc229498352"/>
       <w:r>
         <w:rPr>
           <w:rFonts w:ascii="Arial" w:hAnsi="Arial" w:cs="Arial"/>
           <w:b/>
           <w:bCs/>
-          <w:sz w:val="28"/>
-          <w:szCs w:val="28"/>
+          <w:color w:val="000000" w:themeColor="text1"/>
         </w:rPr>
         <w:t>Requisitos Funcionales (RF)</w:t>
       </w:r>
-      <w:bookmarkEnd w:id="2"/>
+      <w:bookmarkEnd w:id="9"/>
     </w:p>
     <w:p>
       <w:pPr>
@@ -6077,6 +7593,7 @@
           <w:ilvl w:val="0"/>
           <w:numId w:val="2"/>
         </w:numPr>
+        <w:spacing w:line="360" w:lineRule="auto"/>
         <w:jc w:val="both"/>
         <w:rPr>
           <w:rFonts w:ascii="Arial" w:hAnsi="Arial" w:cs="Arial"/>
@@ -6115,6 +7632,7 @@
           <w:ilvl w:val="0"/>
           <w:numId w:val="2"/>
         </w:numPr>
+        <w:spacing w:line="360" w:lineRule="auto"/>
         <w:jc w:val="both"/>
         <w:rPr>
           <w:rFonts w:ascii="Arial" w:hAnsi="Arial" w:cs="Arial"/>
@@ -6141,6 +7659,7 @@
           <w:ilvl w:val="0"/>
           <w:numId w:val="2"/>
         </w:numPr>
+        <w:spacing w:line="360" w:lineRule="auto"/>
         <w:jc w:val="both"/>
         <w:rPr>
           <w:rFonts w:ascii="Arial" w:hAnsi="Arial" w:cs="Arial"/>
@@ -6173,6 +7692,7 @@
           <w:ilvl w:val="0"/>
           <w:numId w:val="2"/>
         </w:numPr>
+        <w:spacing w:line="360" w:lineRule="auto"/>
         <w:jc w:val="both"/>
         <w:rPr>
           <w:rFonts w:ascii="Arial" w:hAnsi="Arial" w:cs="Arial"/>
@@ -6211,6 +7731,7 @@
           <w:ilvl w:val="0"/>
           <w:numId w:val="2"/>
         </w:numPr>
+        <w:spacing w:line="360" w:lineRule="auto"/>
         <w:jc w:val="both"/>
         <w:rPr>
           <w:rFonts w:ascii="Arial" w:hAnsi="Arial" w:cs="Arial"/>
@@ -6237,6 +7758,7 @@
           <w:ilvl w:val="0"/>
           <w:numId w:val="2"/>
         </w:numPr>
+        <w:spacing w:line="360" w:lineRule="auto"/>
         <w:jc w:val="both"/>
         <w:rPr>
           <w:rFonts w:ascii="Arial" w:hAnsi="Arial" w:cs="Arial"/>
@@ -6283,6 +7805,7 @@
           <w:ilvl w:val="0"/>
           <w:numId w:val="2"/>
         </w:numPr>
+        <w:spacing w:line="360" w:lineRule="auto"/>
         <w:jc w:val="both"/>
         <w:rPr>
           <w:rFonts w:ascii="Arial" w:hAnsi="Arial" w:cs="Arial"/>
@@ -6317,6 +7840,7 @@
           <w:ilvl w:val="0"/>
           <w:numId w:val="2"/>
         </w:numPr>
+        <w:spacing w:line="360" w:lineRule="auto"/>
         <w:jc w:val="both"/>
         <w:rPr>
           <w:rFonts w:ascii="Arial" w:hAnsi="Arial" w:cs="Arial"/>
@@ -6343,6 +7867,7 @@
           <w:ilvl w:val="0"/>
           <w:numId w:val="2"/>
         </w:numPr>
+        <w:spacing w:line="360" w:lineRule="auto"/>
         <w:jc w:val="both"/>
         <w:rPr>
           <w:rFonts w:ascii="Arial" w:hAnsi="Arial" w:cs="Arial"/>
@@ -6375,6 +7900,7 @@
           <w:ilvl w:val="0"/>
           <w:numId w:val="2"/>
         </w:numPr>
+        <w:spacing w:line="360" w:lineRule="auto"/>
         <w:jc w:val="both"/>
         <w:rPr>
           <w:rFonts w:ascii="Arial" w:hAnsi="Arial" w:cs="Arial"/>
@@ -6401,6 +7927,7 @@
           <w:ilvl w:val="0"/>
           <w:numId w:val="2"/>
         </w:numPr>
+        <w:spacing w:line="360" w:lineRule="auto"/>
         <w:jc w:val="both"/>
         <w:rPr>
           <w:rFonts w:ascii="Arial" w:hAnsi="Arial" w:cs="Arial"/>
@@ -6428,7 +7955,7 @@
           <w:ilvl w:val="0"/>
           <w:numId w:val="2"/>
         </w:numPr>
-        <w:spacing w:before="0" w:beforeAutospacing="0" w:after="240" w:afterAutospacing="0"/>
+        <w:spacing w:before="0" w:beforeAutospacing="0" w:after="240" w:afterAutospacing="0" w:line="360" w:lineRule="auto"/>
         <w:rPr>
           <w:rFonts w:ascii="Arial" w:hAnsi="Arial" w:cs="Arial"/>
           <w:color w:val="000000"/>
@@ -6465,7 +7992,7 @@
           <w:ilvl w:val="0"/>
           <w:numId w:val="2"/>
         </w:numPr>
-        <w:spacing w:before="0" w:beforeAutospacing="0" w:after="240" w:afterAutospacing="0"/>
+        <w:spacing w:before="0" w:beforeAutospacing="0" w:after="240" w:afterAutospacing="0" w:line="360" w:lineRule="auto"/>
         <w:rPr>
           <w:rFonts w:ascii="Arial" w:hAnsi="Arial" w:cs="Arial"/>
           <w:color w:val="000000"/>
@@ -6477,6 +8004,7 @@
           <w:rFonts w:ascii="Arial" w:eastAsiaTheme="majorEastAsia" w:hAnsi="Arial" w:cs="Arial"/>
           <w:color w:val="000000"/>
         </w:rPr>
+        <w:lastRenderedPageBreak/>
         <w:t>RF13:</w:t>
       </w:r>
       <w:r>
@@ -6502,7 +8030,7 @@
           <w:ilvl w:val="0"/>
           <w:numId w:val="2"/>
         </w:numPr>
-        <w:spacing w:before="0" w:beforeAutospacing="0" w:after="240" w:afterAutospacing="0"/>
+        <w:spacing w:before="0" w:beforeAutospacing="0" w:after="240" w:afterAutospacing="0" w:line="360" w:lineRule="auto"/>
         <w:rPr>
           <w:rFonts w:ascii="Arial" w:hAnsi="Arial" w:cs="Arial"/>
           <w:color w:val="000000"/>
@@ -6539,7 +8067,7 @@
           <w:ilvl w:val="0"/>
           <w:numId w:val="2"/>
         </w:numPr>
-        <w:spacing w:before="0" w:beforeAutospacing="0" w:after="240" w:afterAutospacing="0"/>
+        <w:spacing w:before="0" w:beforeAutospacing="0" w:after="240" w:afterAutospacing="0" w:line="360" w:lineRule="auto"/>
         <w:rPr>
           <w:rFonts w:ascii="Arial" w:hAnsi="Arial" w:cs="Arial"/>
           <w:color w:val="000000"/>
@@ -6576,7 +8104,7 @@
           <w:ilvl w:val="0"/>
           <w:numId w:val="2"/>
         </w:numPr>
-        <w:spacing w:before="0" w:beforeAutospacing="0" w:after="240" w:afterAutospacing="0"/>
+        <w:spacing w:before="0" w:beforeAutospacing="0" w:after="240" w:afterAutospacing="0" w:line="360" w:lineRule="auto"/>
         <w:rPr>
           <w:rFonts w:ascii="Arial" w:hAnsi="Arial" w:cs="Arial"/>
           <w:color w:val="000000"/>
@@ -6613,7 +8141,7 @@
           <w:ilvl w:val="0"/>
           <w:numId w:val="2"/>
         </w:numPr>
-        <w:spacing w:before="0" w:beforeAutospacing="0" w:after="240" w:afterAutospacing="0"/>
+        <w:spacing w:before="0" w:beforeAutospacing="0" w:after="240" w:afterAutospacing="0" w:line="360" w:lineRule="auto"/>
         <w:rPr>
           <w:rFonts w:ascii="Arial" w:hAnsi="Arial" w:cs="Arial"/>
           <w:color w:val="000000"/>
@@ -6650,7 +8178,7 @@
           <w:ilvl w:val="0"/>
           <w:numId w:val="2"/>
         </w:numPr>
-        <w:spacing w:before="0" w:beforeAutospacing="0" w:after="240" w:afterAutospacing="0"/>
+        <w:spacing w:before="0" w:beforeAutospacing="0" w:after="240" w:afterAutospacing="0" w:line="360" w:lineRule="auto"/>
         <w:rPr>
           <w:rFonts w:ascii="Arial" w:hAnsi="Arial" w:cs="Arial"/>
           <w:color w:val="000000"/>
@@ -6687,7 +8215,7 @@
           <w:ilvl w:val="0"/>
           <w:numId w:val="2"/>
         </w:numPr>
-        <w:spacing w:before="0" w:beforeAutospacing="0" w:after="240" w:afterAutospacing="0"/>
+        <w:spacing w:before="0" w:beforeAutospacing="0" w:after="240" w:afterAutospacing="0" w:line="360" w:lineRule="auto"/>
         <w:rPr>
           <w:rFonts w:ascii="Arial" w:hAnsi="Arial" w:cs="Arial"/>
           <w:color w:val="000000"/>
@@ -6699,16 +8227,7 @@
           <w:rFonts w:ascii="Arial" w:eastAsiaTheme="majorEastAsia" w:hAnsi="Arial" w:cs="Arial"/>
           <w:color w:val="000000"/>
         </w:rPr>
-        <w:lastRenderedPageBreak/>
-        <w:t>RF1</w:t>
-      </w:r>
-      <w:r>
-        <w:rPr>
-          <w:rStyle w:val="Textoennegrita"/>
-          <w:rFonts w:ascii="Arial" w:eastAsiaTheme="majorEastAsia" w:hAnsi="Arial" w:cs="Arial"/>
-          <w:color w:val="000000"/>
-        </w:rPr>
-        <w:t xml:space="preserve">9: </w:t>
+        <w:t xml:space="preserve">RF19: </w:t>
       </w:r>
       <w:r>
         <w:rPr>
@@ -6725,7 +8244,7 @@
           <w:ilvl w:val="0"/>
           <w:numId w:val="2"/>
         </w:numPr>
-        <w:spacing w:before="0" w:beforeAutospacing="0" w:after="240" w:afterAutospacing="0"/>
+        <w:spacing w:before="0" w:beforeAutospacing="0" w:after="240" w:afterAutospacing="0" w:line="360" w:lineRule="auto"/>
         <w:rPr>
           <w:rFonts w:ascii="Arial" w:hAnsi="Arial" w:cs="Arial"/>
           <w:color w:val="000000"/>
@@ -6760,14 +8279,7 @@
           <w:rFonts w:ascii="Arial" w:hAnsi="Arial" w:cs="Arial"/>
           <w:color w:val="000000"/>
         </w:rPr>
-        <w:t xml:space="preserve"> </w:t>
-      </w:r>
-      <w:r>
-        <w:rPr>
-          <w:rFonts w:ascii="Arial" w:hAnsi="Arial" w:cs="Arial"/>
-          <w:color w:val="000000"/>
-        </w:rPr>
-        <w:t>El sistema debe generar el carnet digital del tutorado con el registro de actividades y sesiones asistidas durante el semestre</w:t>
+        <w:t xml:space="preserve"> El sistema debe generar el carnet digital del tutorado con el registro de actividades y sesiones asistidas durante el semestre</w:t>
       </w:r>
       <w:r>
         <w:rPr>
@@ -6791,7 +8303,7 @@
           <w:ilvl w:val="0"/>
           <w:numId w:val="2"/>
         </w:numPr>
-        <w:spacing w:before="0" w:beforeAutospacing="0" w:after="240" w:afterAutospacing="0"/>
+        <w:spacing w:before="0" w:beforeAutospacing="0" w:after="240" w:afterAutospacing="0" w:line="360" w:lineRule="auto"/>
         <w:rPr>
           <w:rFonts w:ascii="Arial" w:hAnsi="Arial" w:cs="Arial"/>
           <w:color w:val="000000"/>
@@ -6826,7 +8338,7 @@
           <w:ilvl w:val="0"/>
           <w:numId w:val="2"/>
         </w:numPr>
-        <w:spacing w:before="0" w:beforeAutospacing="0" w:after="240" w:afterAutospacing="0"/>
+        <w:spacing w:before="0" w:beforeAutospacing="0" w:after="240" w:afterAutospacing="0" w:line="360" w:lineRule="auto"/>
         <w:rPr>
           <w:rFonts w:ascii="Arial" w:hAnsi="Arial" w:cs="Arial"/>
           <w:color w:val="000000"/>
@@ -6861,7 +8373,7 @@
           <w:ilvl w:val="0"/>
           <w:numId w:val="2"/>
         </w:numPr>
-        <w:spacing w:after="240"/>
+        <w:spacing w:after="240" w:line="360" w:lineRule="auto"/>
         <w:rPr>
           <w:rFonts w:ascii="Arial" w:hAnsi="Arial" w:cs="Arial"/>
           <w:color w:val="000000"/>
@@ -6891,6 +8403,7 @@
     </w:p>
     <w:p>
       <w:pPr>
+        <w:spacing w:line="360" w:lineRule="auto"/>
         <w:jc w:val="both"/>
         <w:rPr>
           <w:rFonts w:ascii="Arial" w:hAnsi="Arial" w:cs="Arial"/>
@@ -6900,26 +8413,30 @@
     <w:p>
       <w:pPr>
         <w:pStyle w:val="Ttulo2"/>
+        <w:spacing w:line="360" w:lineRule="auto"/>
         <w:rPr>
           <w:rFonts w:ascii="Arial" w:hAnsi="Arial" w:cs="Arial"/>
           <w:b/>
           <w:bCs/>
+          <w:color w:val="000000" w:themeColor="text1"/>
           <w:sz w:val="28"/>
           <w:szCs w:val="28"/>
         </w:rPr>
       </w:pPr>
-      <w:bookmarkStart w:id="3" w:name="_Toc227795038"/>
+      <w:bookmarkStart w:id="10" w:name="_Toc229498353"/>
       <w:r>
         <w:rPr>
           <w:rFonts w:ascii="Arial" w:hAnsi="Arial" w:cs="Arial"/>
           <w:b/>
           <w:bCs/>
+          <w:color w:val="000000" w:themeColor="text1"/>
           <w:sz w:val="28"/>
           <w:szCs w:val="28"/>
         </w:rPr>
+        <w:lastRenderedPageBreak/>
         <w:t>Requisitos No Funcionales (RNF)</w:t>
       </w:r>
-      <w:bookmarkEnd w:id="3"/>
+      <w:bookmarkEnd w:id="10"/>
     </w:p>
     <w:p>
       <w:pPr>
@@ -6927,6 +8444,7 @@
           <w:ilvl w:val="0"/>
           <w:numId w:val="3"/>
         </w:numPr>
+        <w:spacing w:line="360" w:lineRule="auto"/>
         <w:jc w:val="both"/>
         <w:rPr>
           <w:rFonts w:ascii="Arial" w:hAnsi="Arial" w:cs="Arial"/>
@@ -6953,6 +8471,7 @@
           <w:ilvl w:val="0"/>
           <w:numId w:val="3"/>
         </w:numPr>
+        <w:spacing w:line="360" w:lineRule="auto"/>
         <w:jc w:val="both"/>
         <w:rPr>
           <w:rFonts w:ascii="Arial" w:hAnsi="Arial" w:cs="Arial"/>
@@ -6979,6 +8498,7 @@
           <w:ilvl w:val="0"/>
           <w:numId w:val="3"/>
         </w:numPr>
+        <w:spacing w:line="360" w:lineRule="auto"/>
         <w:jc w:val="both"/>
         <w:rPr>
           <w:rFonts w:ascii="Arial" w:hAnsi="Arial" w:cs="Arial"/>
@@ -7005,6 +8525,7 @@
           <w:ilvl w:val="0"/>
           <w:numId w:val="3"/>
         </w:numPr>
+        <w:spacing w:line="360" w:lineRule="auto"/>
         <w:jc w:val="both"/>
         <w:rPr>
           <w:rFonts w:ascii="Arial" w:hAnsi="Arial" w:cs="Arial"/>
@@ -7059,6 +8580,7 @@
           <w:ilvl w:val="0"/>
           <w:numId w:val="3"/>
         </w:numPr>
+        <w:spacing w:line="360" w:lineRule="auto"/>
         <w:jc w:val="both"/>
         <w:rPr>
           <w:rFonts w:ascii="Arial" w:hAnsi="Arial" w:cs="Arial"/>
@@ -7097,6 +8619,7 @@
     </w:p>
     <w:p>
       <w:pPr>
+        <w:spacing w:line="360" w:lineRule="auto"/>
         <w:rPr>
           <w:rFonts w:ascii="Arial" w:hAnsi="Arial" w:cs="Arial"/>
           <w:b/>
@@ -7115,21 +8638,24 @@
     <w:p>
       <w:pPr>
         <w:pStyle w:val="Ttulo1"/>
+        <w:spacing w:line="360" w:lineRule="auto"/>
         <w:jc w:val="center"/>
         <w:rPr>
           <w:rFonts w:ascii="Arial" w:hAnsi="Arial" w:cs="Arial"/>
           <w:b/>
           <w:bCs/>
+          <w:color w:val="000000" w:themeColor="text1"/>
           <w:sz w:val="36"/>
           <w:szCs w:val="36"/>
         </w:rPr>
       </w:pPr>
-      <w:bookmarkStart w:id="4" w:name="_Toc227795039"/>
+      <w:bookmarkStart w:id="11" w:name="_Toc229498354"/>
       <w:r>
         <w:rPr>
           <w:rFonts w:ascii="Arial" w:hAnsi="Arial" w:cs="Arial"/>
           <w:b/>
           <w:bCs/>
+          <w:color w:val="000000" w:themeColor="text1"/>
           <w:sz w:val="36"/>
           <w:szCs w:val="36"/>
         </w:rPr>
@@ -7141,12 +8667,13 @@
           <w:rFonts w:ascii="Arial" w:hAnsi="Arial" w:cs="Arial"/>
           <w:b/>
           <w:bCs/>
+          <w:color w:val="000000" w:themeColor="text1"/>
           <w:sz w:val="36"/>
           <w:szCs w:val="36"/>
         </w:rPr>
         <w:t>s</w:t>
       </w:r>
-      <w:bookmarkEnd w:id="4"/>
+      <w:bookmarkEnd w:id="11"/>
     </w:p>
     <w:tbl>
       <w:tblPr>
@@ -7166,6 +8693,7 @@
           </w:tcPr>
           <w:p>
             <w:pPr>
+              <w:spacing w:line="360" w:lineRule="auto"/>
               <w:jc w:val="center"/>
               <w:rPr>
                 <w:rFonts w:ascii="Arial" w:hAnsi="Arial" w:cs="Arial"/>
@@ -7191,6 +8719,7 @@
           </w:tcPr>
           <w:p>
             <w:pPr>
+              <w:spacing w:line="360" w:lineRule="auto"/>
               <w:jc w:val="center"/>
               <w:rPr>
                 <w:rFonts w:ascii="Arial" w:hAnsi="Arial" w:cs="Arial"/>
@@ -7216,6 +8745,7 @@
           </w:tcPr>
           <w:p>
             <w:pPr>
+              <w:spacing w:line="360" w:lineRule="auto"/>
               <w:jc w:val="center"/>
               <w:rPr>
                 <w:rFonts w:ascii="Arial" w:hAnsi="Arial" w:cs="Arial"/>
@@ -7243,6 +8773,7 @@
           </w:tcPr>
           <w:p>
             <w:pPr>
+              <w:spacing w:line="360" w:lineRule="auto"/>
               <w:rPr>
                 <w:rFonts w:ascii="Arial" w:hAnsi="Arial" w:cs="Arial"/>
               </w:rPr>
@@ -7263,6 +8794,7 @@
           </w:tcPr>
           <w:p>
             <w:pPr>
+              <w:spacing w:line="360" w:lineRule="auto"/>
               <w:jc w:val="center"/>
               <w:rPr>
                 <w:rFonts w:ascii="Arial" w:hAnsi="Arial" w:cs="Arial"/>
@@ -7282,6 +8814,7 @@
           </w:tcPr>
           <w:p>
             <w:pPr>
+              <w:spacing w:line="360" w:lineRule="auto"/>
               <w:rPr>
                 <w:rFonts w:ascii="Arial" w:hAnsi="Arial" w:cs="Arial"/>
               </w:rPr>
@@ -7308,6 +8841,7 @@
           </w:tcPr>
           <w:p>
             <w:pPr>
+              <w:spacing w:line="360" w:lineRule="auto"/>
               <w:rPr>
                 <w:rFonts w:ascii="Arial" w:hAnsi="Arial" w:cs="Arial"/>
               </w:rPr>
@@ -7328,6 +8862,7 @@
           </w:tcPr>
           <w:p>
             <w:pPr>
+              <w:spacing w:line="360" w:lineRule="auto"/>
               <w:jc w:val="center"/>
               <w:rPr>
                 <w:rFonts w:ascii="Arial" w:hAnsi="Arial" w:cs="Arial"/>
@@ -7347,6 +8882,7 @@
           </w:tcPr>
           <w:p>
             <w:pPr>
+              <w:spacing w:line="360" w:lineRule="auto"/>
               <w:rPr>
                 <w:rFonts w:ascii="Arial" w:hAnsi="Arial" w:cs="Arial"/>
               </w:rPr>
@@ -7367,6 +8903,7 @@
           </w:tcPr>
           <w:p>
             <w:pPr>
+              <w:spacing w:line="360" w:lineRule="auto"/>
               <w:rPr>
                 <w:rFonts w:ascii="Arial" w:hAnsi="Arial" w:cs="Arial"/>
               </w:rPr>
@@ -7387,6 +8924,7 @@
           </w:tcPr>
           <w:p>
             <w:pPr>
+              <w:spacing w:line="360" w:lineRule="auto"/>
               <w:jc w:val="center"/>
               <w:rPr>
                 <w:rFonts w:ascii="Arial" w:hAnsi="Arial" w:cs="Arial"/>
@@ -7406,6 +8944,7 @@
           </w:tcPr>
           <w:p>
             <w:pPr>
+              <w:spacing w:line="360" w:lineRule="auto"/>
               <w:rPr>
                 <w:rFonts w:ascii="Arial" w:hAnsi="Arial" w:cs="Arial"/>
               </w:rPr>
@@ -7426,6 +8965,7 @@
           </w:tcPr>
           <w:p>
             <w:pPr>
+              <w:spacing w:line="360" w:lineRule="auto"/>
               <w:rPr>
                 <w:rFonts w:ascii="Arial" w:hAnsi="Arial" w:cs="Arial"/>
               </w:rPr>
@@ -7446,6 +8986,7 @@
           </w:tcPr>
           <w:p>
             <w:pPr>
+              <w:spacing w:line="360" w:lineRule="auto"/>
               <w:jc w:val="center"/>
               <w:rPr>
                 <w:rFonts w:ascii="Arial" w:hAnsi="Arial" w:cs="Arial"/>
@@ -7465,6 +9006,7 @@
           </w:tcPr>
           <w:p>
             <w:pPr>
+              <w:spacing w:line="360" w:lineRule="auto"/>
               <w:rPr>
                 <w:rFonts w:ascii="Arial" w:hAnsi="Arial" w:cs="Arial"/>
               </w:rPr>
@@ -7485,6 +9027,7 @@
           </w:tcPr>
           <w:p>
             <w:pPr>
+              <w:spacing w:line="360" w:lineRule="auto"/>
               <w:rPr>
                 <w:rFonts w:ascii="Arial" w:hAnsi="Arial" w:cs="Arial"/>
               </w:rPr>
@@ -7505,6 +9048,7 @@
           </w:tcPr>
           <w:p>
             <w:pPr>
+              <w:spacing w:line="360" w:lineRule="auto"/>
               <w:jc w:val="center"/>
               <w:rPr>
                 <w:rFonts w:ascii="Arial" w:hAnsi="Arial" w:cs="Arial"/>
@@ -7524,6 +9068,7 @@
           </w:tcPr>
           <w:p>
             <w:pPr>
+              <w:spacing w:line="360" w:lineRule="auto"/>
               <w:rPr>
                 <w:rFonts w:ascii="Arial" w:hAnsi="Arial" w:cs="Arial"/>
               </w:rPr>
@@ -7544,6 +9089,7 @@
           </w:tcPr>
           <w:p>
             <w:pPr>
+              <w:spacing w:line="360" w:lineRule="auto"/>
               <w:rPr>
                 <w:rFonts w:ascii="Arial" w:hAnsi="Arial" w:cs="Arial"/>
               </w:rPr>
@@ -7564,6 +9110,7 @@
           </w:tcPr>
           <w:p>
             <w:pPr>
+              <w:spacing w:line="360" w:lineRule="auto"/>
               <w:jc w:val="center"/>
               <w:rPr>
                 <w:rFonts w:ascii="Arial" w:hAnsi="Arial" w:cs="Arial"/>
@@ -7583,6 +9130,7 @@
           </w:tcPr>
           <w:p>
             <w:pPr>
+              <w:spacing w:line="360" w:lineRule="auto"/>
               <w:rPr>
                 <w:rFonts w:ascii="Arial" w:hAnsi="Arial" w:cs="Arial"/>
               </w:rPr>
@@ -7603,6 +9151,7 @@
           </w:tcPr>
           <w:p>
             <w:pPr>
+              <w:spacing w:line="360" w:lineRule="auto"/>
               <w:rPr>
                 <w:rFonts w:ascii="Arial" w:hAnsi="Arial" w:cs="Arial"/>
               </w:rPr>
@@ -7623,6 +9172,7 @@
           </w:tcPr>
           <w:p>
             <w:pPr>
+              <w:spacing w:line="360" w:lineRule="auto"/>
               <w:jc w:val="center"/>
               <w:rPr>
                 <w:rFonts w:ascii="Arial" w:hAnsi="Arial" w:cs="Arial"/>
@@ -7642,6 +9192,7 @@
           </w:tcPr>
           <w:p>
             <w:pPr>
+              <w:spacing w:line="360" w:lineRule="auto"/>
               <w:rPr>
                 <w:rFonts w:ascii="Arial" w:hAnsi="Arial" w:cs="Arial"/>
               </w:rPr>
@@ -7662,6 +9213,7 @@
           </w:tcPr>
           <w:p>
             <w:pPr>
+              <w:spacing w:line="360" w:lineRule="auto"/>
               <w:rPr>
                 <w:rFonts w:ascii="Arial" w:hAnsi="Arial" w:cs="Arial"/>
               </w:rPr>
@@ -7682,6 +9234,7 @@
           </w:tcPr>
           <w:p>
             <w:pPr>
+              <w:spacing w:line="360" w:lineRule="auto"/>
               <w:jc w:val="center"/>
               <w:rPr>
                 <w:rFonts w:ascii="Arial" w:hAnsi="Arial" w:cs="Arial"/>
@@ -7701,6 +9254,7 @@
           </w:tcPr>
           <w:p>
             <w:pPr>
+              <w:spacing w:line="360" w:lineRule="auto"/>
               <w:rPr>
                 <w:rFonts w:ascii="Arial" w:hAnsi="Arial" w:cs="Arial"/>
               </w:rPr>
@@ -7721,6 +9275,7 @@
           </w:tcPr>
           <w:p>
             <w:pPr>
+              <w:spacing w:line="360" w:lineRule="auto"/>
               <w:rPr>
                 <w:rFonts w:ascii="Arial" w:hAnsi="Arial" w:cs="Arial"/>
               </w:rPr>
@@ -7749,6 +9304,7 @@
           </w:tcPr>
           <w:p>
             <w:pPr>
+              <w:spacing w:line="360" w:lineRule="auto"/>
               <w:jc w:val="center"/>
               <w:rPr>
                 <w:rFonts w:ascii="Arial" w:hAnsi="Arial" w:cs="Arial"/>
@@ -7768,6 +9324,7 @@
           </w:tcPr>
           <w:p>
             <w:pPr>
+              <w:spacing w:line="360" w:lineRule="auto"/>
               <w:rPr>
                 <w:rFonts w:ascii="Arial" w:hAnsi="Arial" w:cs="Arial"/>
               </w:rPr>
@@ -7788,6 +9345,7 @@
           </w:tcPr>
           <w:p>
             <w:pPr>
+              <w:spacing w:line="360" w:lineRule="auto"/>
               <w:rPr>
                 <w:rFonts w:ascii="Arial" w:hAnsi="Arial" w:cs="Arial"/>
               </w:rPr>
@@ -7798,6 +9356,7 @@
                 <w:b/>
                 <w:bCs/>
               </w:rPr>
+              <w:lastRenderedPageBreak/>
               <w:t>Gestión de coordinadores de tutorías</w:t>
             </w:r>
           </w:p>
@@ -7808,6 +9367,7 @@
           </w:tcPr>
           <w:p>
             <w:pPr>
+              <w:spacing w:line="360" w:lineRule="auto"/>
               <w:jc w:val="center"/>
               <w:rPr>
                 <w:rFonts w:ascii="Arial" w:hAnsi="Arial" w:cs="Arial"/>
@@ -7827,6 +9387,7 @@
           </w:tcPr>
           <w:p>
             <w:pPr>
+              <w:spacing w:line="360" w:lineRule="auto"/>
               <w:rPr>
                 <w:rFonts w:ascii="Arial" w:hAnsi="Arial" w:cs="Arial"/>
               </w:rPr>
@@ -7847,6 +9408,7 @@
           </w:tcPr>
           <w:p>
             <w:pPr>
+              <w:spacing w:line="360" w:lineRule="auto"/>
               <w:rPr>
                 <w:rFonts w:ascii="Arial" w:hAnsi="Arial" w:cs="Arial"/>
               </w:rPr>
@@ -7867,6 +9429,7 @@
           </w:tcPr>
           <w:p>
             <w:pPr>
+              <w:spacing w:line="360" w:lineRule="auto"/>
               <w:jc w:val="center"/>
               <w:rPr>
                 <w:rFonts w:ascii="Arial" w:hAnsi="Arial" w:cs="Arial"/>
@@ -7886,6 +9449,7 @@
           </w:tcPr>
           <w:p>
             <w:pPr>
+              <w:spacing w:line="360" w:lineRule="auto"/>
               <w:rPr>
                 <w:rFonts w:ascii="Arial" w:hAnsi="Arial" w:cs="Arial"/>
               </w:rPr>
@@ -7906,6 +9470,7 @@
           </w:tcPr>
           <w:p>
             <w:pPr>
+              <w:spacing w:line="360" w:lineRule="auto"/>
               <w:rPr>
                 <w:rFonts w:ascii="Arial" w:hAnsi="Arial" w:cs="Arial"/>
               </w:rPr>
@@ -7926,6 +9491,7 @@
           </w:tcPr>
           <w:p>
             <w:pPr>
+              <w:spacing w:line="360" w:lineRule="auto"/>
               <w:jc w:val="center"/>
               <w:rPr>
                 <w:rFonts w:ascii="Arial" w:hAnsi="Arial" w:cs="Arial"/>
@@ -7945,6 +9511,7 @@
           </w:tcPr>
           <w:p>
             <w:pPr>
+              <w:spacing w:line="360" w:lineRule="auto"/>
               <w:rPr>
                 <w:rFonts w:ascii="Arial" w:hAnsi="Arial" w:cs="Arial"/>
               </w:rPr>
@@ -7965,6 +9532,7 @@
           </w:tcPr>
           <w:p>
             <w:pPr>
+              <w:spacing w:line="360" w:lineRule="auto"/>
               <w:rPr>
                 <w:rFonts w:ascii="Arial" w:hAnsi="Arial" w:cs="Arial"/>
               </w:rPr>
@@ -7985,6 +9553,7 @@
           </w:tcPr>
           <w:p>
             <w:pPr>
+              <w:spacing w:line="360" w:lineRule="auto"/>
               <w:jc w:val="center"/>
               <w:rPr>
                 <w:rFonts w:ascii="Arial" w:hAnsi="Arial" w:cs="Arial"/>
@@ -8004,6 +9573,7 @@
           </w:tcPr>
           <w:p>
             <w:pPr>
+              <w:spacing w:line="360" w:lineRule="auto"/>
               <w:rPr>
                 <w:rFonts w:ascii="Arial" w:hAnsi="Arial" w:cs="Arial"/>
               </w:rPr>
@@ -8024,6 +9594,7 @@
           </w:tcPr>
           <w:p>
             <w:pPr>
+              <w:spacing w:line="360" w:lineRule="auto"/>
               <w:rPr>
                 <w:rFonts w:ascii="Arial" w:hAnsi="Arial" w:cs="Arial"/>
               </w:rPr>
@@ -8044,6 +9615,7 @@
           </w:tcPr>
           <w:p>
             <w:pPr>
+              <w:spacing w:line="360" w:lineRule="auto"/>
               <w:jc w:val="center"/>
               <w:rPr>
                 <w:rFonts w:ascii="Arial" w:hAnsi="Arial" w:cs="Arial"/>
@@ -8063,6 +9635,7 @@
           </w:tcPr>
           <w:p>
             <w:pPr>
+              <w:spacing w:line="360" w:lineRule="auto"/>
               <w:rPr>
                 <w:rFonts w:ascii="Arial" w:hAnsi="Arial" w:cs="Arial"/>
               </w:rPr>
@@ -8083,6 +9656,7 @@
           </w:tcPr>
           <w:p>
             <w:pPr>
+              <w:spacing w:line="360" w:lineRule="auto"/>
               <w:rPr>
                 <w:rFonts w:ascii="Arial" w:hAnsi="Arial" w:cs="Arial"/>
               </w:rPr>
@@ -8103,6 +9677,7 @@
           </w:tcPr>
           <w:p>
             <w:pPr>
+              <w:spacing w:line="360" w:lineRule="auto"/>
               <w:jc w:val="center"/>
               <w:rPr>
                 <w:rFonts w:ascii="Arial" w:hAnsi="Arial" w:cs="Arial"/>
@@ -8122,6 +9697,7 @@
           </w:tcPr>
           <w:p>
             <w:pPr>
+              <w:spacing w:line="360" w:lineRule="auto"/>
               <w:rPr>
                 <w:rFonts w:ascii="Arial" w:hAnsi="Arial" w:cs="Arial"/>
               </w:rPr>
@@ -8145,6 +9721,7 @@
           </w:tcPr>
           <w:p>
             <w:pPr>
+              <w:spacing w:line="360" w:lineRule="auto"/>
               <w:rPr>
                 <w:rFonts w:ascii="Arial" w:hAnsi="Arial" w:cs="Arial"/>
               </w:rPr>
@@ -8155,7 +9732,6 @@
                 <w:b/>
                 <w:bCs/>
               </w:rPr>
-              <w:lastRenderedPageBreak/>
               <w:t>Enviar notificación semanal de actividades</w:t>
             </w:r>
           </w:p>
@@ -8166,6 +9742,7 @@
           </w:tcPr>
           <w:p>
             <w:pPr>
+              <w:spacing w:line="360" w:lineRule="auto"/>
               <w:jc w:val="center"/>
               <w:rPr>
                 <w:rFonts w:ascii="Arial" w:hAnsi="Arial" w:cs="Arial"/>
@@ -8185,6 +9762,7 @@
           </w:tcPr>
           <w:p>
             <w:pPr>
+              <w:spacing w:line="360" w:lineRule="auto"/>
               <w:rPr>
                 <w:rFonts w:ascii="Arial" w:hAnsi="Arial" w:cs="Arial"/>
               </w:rPr>
@@ -8201,6 +9779,7 @@
     </w:tbl>
     <w:p>
       <w:pPr>
+        <w:spacing w:line="360" w:lineRule="auto"/>
         <w:rPr>
           <w:rFonts w:ascii="Arial" w:hAnsi="Arial" w:cs="Arial"/>
           <w:b/>
@@ -8211,30 +9790,35 @@
     <w:p>
       <w:pPr>
         <w:pStyle w:val="Ttulo1"/>
+        <w:spacing w:line="360" w:lineRule="auto"/>
         <w:jc w:val="center"/>
         <w:rPr>
           <w:rFonts w:ascii="Arial" w:hAnsi="Arial" w:cs="Arial"/>
           <w:b/>
           <w:bCs/>
+          <w:color w:val="000000" w:themeColor="text1"/>
           <w:sz w:val="32"/>
           <w:szCs w:val="32"/>
         </w:rPr>
       </w:pPr>
-      <w:bookmarkStart w:id="5" w:name="_Toc227795040"/>
+      <w:bookmarkStart w:id="12" w:name="_Toc229498355"/>
       <w:r>
         <w:rPr>
           <w:rFonts w:ascii="Arial" w:hAnsi="Arial" w:cs="Arial"/>
           <w:b/>
           <w:bCs/>
+          <w:color w:val="000000" w:themeColor="text1"/>
           <w:sz w:val="32"/>
           <w:szCs w:val="32"/>
         </w:rPr>
+        <w:lastRenderedPageBreak/>
         <w:t>Diagrama de Casos de Uso</w:t>
       </w:r>
-      <w:bookmarkEnd w:id="5"/>
+      <w:bookmarkEnd w:id="12"/>
     </w:p>
     <w:p>
       <w:pPr>
+        <w:spacing w:line="360" w:lineRule="auto"/>
         <w:jc w:val="center"/>
         <w:rPr>
           <w:rFonts w:ascii="Arial" w:hAnsi="Arial" w:cs="Arial"/>
@@ -8301,6 +9885,7 @@
     </w:p>
     <w:p>
       <w:pPr>
+        <w:spacing w:line="360" w:lineRule="auto"/>
         <w:jc w:val="center"/>
         <w:rPr>
           <w:rFonts w:ascii="Arial" w:hAnsi="Arial" w:cs="Arial"/>
@@ -8319,13 +9904,14 @@
         </w:rPr>
         <w:br w:type="page"/>
       </w:r>
-      <w:bookmarkStart w:id="6" w:name="_Toc227795041"/>
+      <w:bookmarkStart w:id="13" w:name="_Toc229498356"/>
       <w:r>
         <w:rPr>
           <w:rStyle w:val="Ttulo1Car"/>
           <w:rFonts w:ascii="Arial" w:hAnsi="Arial" w:cs="Arial"/>
           <w:b/>
           <w:bCs/>
+          <w:color w:val="000000" w:themeColor="text1"/>
           <w:sz w:val="36"/>
           <w:szCs w:val="36"/>
         </w:rPr>
@@ -8338,12 +9924,13 @@
           <w:rFonts w:ascii="Arial" w:hAnsi="Arial" w:cs="Arial"/>
           <w:b/>
           <w:bCs/>
+          <w:color w:val="000000" w:themeColor="text1"/>
           <w:sz w:val="36"/>
           <w:szCs w:val="36"/>
         </w:rPr>
         <w:t>:</w:t>
       </w:r>
-      <w:bookmarkEnd w:id="6"/>
+      <w:bookmarkEnd w:id="13"/>
       <w:r>
         <w:rPr>
           <w:rFonts w:ascii="Arial" w:hAnsi="Arial" w:cs="Arial"/>
@@ -8355,41 +9942,29 @@
     </w:p>
     <w:p>
       <w:pPr>
-        <w:rPr>
-          <w:rFonts w:ascii="Arial" w:hAnsi="Arial" w:cs="Arial"/>
-          <w:caps/>
-          <w:color w:val="9C9A92"/>
-          <w:spacing w:val="13"/>
-          <w:sz w:val="17"/>
-          <w:szCs w:val="17"/>
-        </w:rPr>
-      </w:pPr>
-      <w:r>
-        <w:rPr>
-          <w:rFonts w:ascii="Arial" w:hAnsi="Arial" w:cs="Arial"/>
-          <w:caps/>
-          <w:color w:val="9C9A92"/>
-          <w:spacing w:val="13"/>
-          <w:sz w:val="17"/>
-          <w:szCs w:val="17"/>
+        <w:pStyle w:val="Ttulo2"/>
+        <w:rPr>
+          <w:rFonts w:ascii="Arial" w:hAnsi="Arial" w:cs="Arial"/>
+          <w:color w:val="000000" w:themeColor="text1"/>
+          <w:sz w:val="28"/>
+          <w:szCs w:val="28"/>
+        </w:rPr>
+      </w:pPr>
+      <w:bookmarkStart w:id="14" w:name="_Toc229498357"/>
+      <w:r>
+        <w:rPr>
+          <w:rFonts w:ascii="Arial" w:hAnsi="Arial" w:cs="Arial"/>
+          <w:color w:val="000000" w:themeColor="text1"/>
+          <w:sz w:val="28"/>
+          <w:szCs w:val="28"/>
         </w:rPr>
         <w:t>1. Login</w:t>
       </w:r>
+      <w:bookmarkEnd w:id="14"/>
     </w:p>
     <w:p>
       <w:pPr>
-        <w:rPr>
-          <w:rFonts w:ascii="Arial" w:hAnsi="Arial" w:cs="Arial"/>
-          <w:caps/>
-          <w:color w:val="9C9A92"/>
-          <w:spacing w:val="13"/>
-          <w:sz w:val="17"/>
-          <w:szCs w:val="17"/>
-        </w:rPr>
-      </w:pPr>
-    </w:p>
-    <w:p>
-      <w:pPr>
+        <w:spacing w:line="360" w:lineRule="auto"/>
         <w:rPr>
           <w:rFonts w:ascii="Arial" w:hAnsi="Arial" w:cs="Arial"/>
           <w:b/>
@@ -8404,9 +9979,9 @@
           <w:noProof/>
         </w:rPr>
         <w:drawing>
-          <wp:inline distT="0" distB="0" distL="0" distR="0" wp14:anchorId="5C197B88" wp14:editId="4E3910D4">
-            <wp:extent cx="5791200" cy="6007100"/>
-            <wp:effectExtent l="0" t="0" r="0" b="0"/>
+          <wp:inline distT="0" distB="0" distL="0" distR="0" wp14:anchorId="5C197B88" wp14:editId="017EBD19">
+            <wp:extent cx="5321466" cy="5519854"/>
+            <wp:effectExtent l="0" t="0" r="0" b="5080"/>
             <wp:docPr id="1931580465" name="Imagen 2"/>
             <wp:cNvGraphicFramePr>
               <a:graphicFrameLocks xmlns:a="http://schemas.openxmlformats.org/drawingml/2006/main" noChangeAspect="1"/>
@@ -8433,7 +10008,7 @@
                   <pic:spPr>
                     <a:xfrm>
                       <a:off x="0" y="0"/>
-                      <a:ext cx="5791200" cy="6007100"/>
+                      <a:ext cx="5334844" cy="5533731"/>
                     </a:xfrm>
                     <a:prstGeom prst="rect">
                       <a:avLst/>
@@ -8448,6 +10023,7 @@
     </w:p>
     <w:p>
       <w:pPr>
+        <w:spacing w:line="360" w:lineRule="auto"/>
         <w:rPr>
           <w:rFonts w:ascii="Arial" w:hAnsi="Arial" w:cs="Arial"/>
           <w:b/>
@@ -8465,39 +10041,30 @@
     </w:p>
     <w:p>
       <w:pPr>
-        <w:rPr>
-          <w:rFonts w:ascii="Arial" w:hAnsi="Arial" w:cs="Arial"/>
-          <w:caps/>
-          <w:color w:val="9C9A92"/>
-          <w:spacing w:val="13"/>
-          <w:sz w:val="17"/>
-          <w:szCs w:val="17"/>
-        </w:rPr>
-      </w:pPr>
-      <w:r>
-        <w:rPr>
-          <w:rFonts w:ascii="Arial" w:hAnsi="Arial" w:cs="Arial"/>
-          <w:caps/>
-          <w:color w:val="9C9A92"/>
-          <w:spacing w:val="13"/>
-          <w:sz w:val="17"/>
-          <w:szCs w:val="17"/>
+        <w:pStyle w:val="Ttulo2"/>
+        <w:rPr>
+          <w:rFonts w:ascii="Arial" w:hAnsi="Arial" w:cs="Arial"/>
+          <w:color w:val="000000" w:themeColor="text1"/>
+          <w:sz w:val="28"/>
+          <w:szCs w:val="28"/>
+        </w:rPr>
+      </w:pPr>
+      <w:bookmarkStart w:id="15" w:name="_Toc229498358"/>
+      <w:r>
+        <w:rPr>
+          <w:rFonts w:ascii="Arial" w:hAnsi="Arial" w:cs="Arial"/>
+          <w:color w:val="000000" w:themeColor="text1"/>
+          <w:sz w:val="28"/>
+          <w:szCs w:val="28"/>
         </w:rPr>
         <w:lastRenderedPageBreak/>
         <w:t>2. Dashboard / inicio</w:t>
       </w:r>
+      <w:bookmarkEnd w:id="15"/>
     </w:p>
     <w:p>
       <w:pPr>
-        <w:rPr>
-          <w:rFonts w:ascii="Arial" w:hAnsi="Arial" w:cs="Arial"/>
-          <w:b/>
-          <w:bCs/>
-        </w:rPr>
-      </w:pPr>
-    </w:p>
-    <w:p>
-      <w:pPr>
+        <w:spacing w:line="360" w:lineRule="auto"/>
         <w:rPr>
           <w:rFonts w:ascii="Arial" w:hAnsi="Arial" w:cs="Arial"/>
           <w:b/>
@@ -8512,9 +10079,9 @@
           <w:noProof/>
         </w:rPr>
         <w:drawing>
-          <wp:inline distT="0" distB="0" distL="0" distR="0" wp14:anchorId="03F11018" wp14:editId="36830191">
-            <wp:extent cx="5943600" cy="3681730"/>
-            <wp:effectExtent l="0" t="0" r="0" b="1270"/>
+          <wp:inline distT="0" distB="0" distL="0" distR="0" wp14:anchorId="03F11018" wp14:editId="5F32B0E0">
+            <wp:extent cx="5664820" cy="3509041"/>
+            <wp:effectExtent l="0" t="0" r="0" b="0"/>
             <wp:docPr id="134084770" name="Imagen 3"/>
             <wp:cNvGraphicFramePr>
               <a:graphicFrameLocks xmlns:a="http://schemas.openxmlformats.org/drawingml/2006/main" noChangeAspect="1"/>
@@ -8541,7 +10108,7 @@
                   <pic:spPr>
                     <a:xfrm>
                       <a:off x="0" y="0"/>
-                      <a:ext cx="5943600" cy="3681730"/>
+                      <a:ext cx="5674388" cy="3514968"/>
                     </a:xfrm>
                     <a:prstGeom prst="rect">
                       <a:avLst/>
@@ -8556,53 +10123,29 @@
     </w:p>
     <w:p>
       <w:pPr>
-        <w:rPr>
-          <w:rFonts w:ascii="Arial" w:hAnsi="Arial" w:cs="Arial"/>
-          <w:caps/>
-          <w:color w:val="9C9A92"/>
-          <w:spacing w:val="13"/>
-          <w:sz w:val="17"/>
-          <w:szCs w:val="17"/>
-        </w:rPr>
-      </w:pPr>
+        <w:pStyle w:val="Ttulo2"/>
+        <w:rPr>
+          <w:rFonts w:ascii="Arial" w:hAnsi="Arial" w:cs="Arial"/>
+          <w:color w:val="000000" w:themeColor="text1"/>
+          <w:sz w:val="28"/>
+          <w:szCs w:val="28"/>
+        </w:rPr>
+      </w:pPr>
+      <w:bookmarkStart w:id="16" w:name="_Toc229498359"/>
+      <w:r>
+        <w:rPr>
+          <w:rFonts w:ascii="Arial" w:hAnsi="Arial" w:cs="Arial"/>
+          <w:color w:val="000000" w:themeColor="text1"/>
+          <w:sz w:val="28"/>
+          <w:szCs w:val="28"/>
+        </w:rPr>
+        <w:t>3. Lista de tutores (con búsqueda)</w:t>
+      </w:r>
+      <w:bookmarkEnd w:id="16"/>
     </w:p>
     <w:p>
       <w:pPr>
-        <w:rPr>
-          <w:rFonts w:ascii="Arial" w:hAnsi="Arial" w:cs="Arial"/>
-          <w:caps/>
-          <w:color w:val="9C9A92"/>
-          <w:spacing w:val="13"/>
-          <w:sz w:val="17"/>
-          <w:szCs w:val="17"/>
-        </w:rPr>
-      </w:pPr>
-      <w:r>
-        <w:rPr>
-          <w:rFonts w:ascii="Arial" w:hAnsi="Arial" w:cs="Arial"/>
-          <w:caps/>
-          <w:color w:val="9C9A92"/>
-          <w:spacing w:val="13"/>
-          <w:sz w:val="17"/>
-          <w:szCs w:val="17"/>
-        </w:rPr>
-        <w:t>3. Lista de tutores (con búsqueda)</w:t>
-      </w:r>
-    </w:p>
-    <w:p>
-      <w:pPr>
-        <w:rPr>
-          <w:rFonts w:ascii="Arial" w:hAnsi="Arial" w:cs="Arial"/>
-          <w:caps/>
-          <w:color w:val="9C9A92"/>
-          <w:spacing w:val="13"/>
-          <w:sz w:val="17"/>
-          <w:szCs w:val="17"/>
-        </w:rPr>
-      </w:pPr>
-    </w:p>
-    <w:p>
-      <w:pPr>
+        <w:spacing w:line="360" w:lineRule="auto"/>
         <w:rPr>
           <w:rFonts w:ascii="Arial" w:hAnsi="Arial" w:cs="Arial"/>
           <w:b/>
@@ -8617,7 +10160,7 @@
           <w:noProof/>
         </w:rPr>
         <w:drawing>
-          <wp:inline distT="0" distB="0" distL="0" distR="0" wp14:anchorId="4C300FC7" wp14:editId="0AB4007A">
+          <wp:inline distT="0" distB="0" distL="0" distR="0" wp14:anchorId="4C300FC7" wp14:editId="68B0BC3F">
             <wp:extent cx="5943600" cy="3672205"/>
             <wp:effectExtent l="0" t="0" r="0" b="0"/>
             <wp:docPr id="1351404457" name="Imagen 4"/>
@@ -8661,6 +10204,7 @@
     </w:p>
     <w:p>
       <w:pPr>
+        <w:spacing w:line="360" w:lineRule="auto"/>
         <w:rPr>
           <w:rFonts w:ascii="Arial" w:hAnsi="Arial" w:cs="Arial"/>
           <w:caps/>
@@ -8673,42 +10217,30 @@
     </w:p>
     <w:p>
       <w:pPr>
-        <w:rPr>
-          <w:rFonts w:ascii="Arial" w:hAnsi="Arial" w:cs="Arial"/>
-          <w:caps/>
-          <w:color w:val="9C9A92"/>
-          <w:spacing w:val="13"/>
-          <w:sz w:val="17"/>
-          <w:szCs w:val="17"/>
-        </w:rPr>
-      </w:pPr>
-      <w:r>
-        <w:rPr>
-          <w:rFonts w:ascii="Arial" w:hAnsi="Arial" w:cs="Arial"/>
-          <w:caps/>
-          <w:color w:val="9C9A92"/>
-          <w:spacing w:val="13"/>
-          <w:sz w:val="17"/>
-          <w:szCs w:val="17"/>
+        <w:pStyle w:val="Ttulo2"/>
+        <w:rPr>
+          <w:rFonts w:ascii="Arial" w:hAnsi="Arial" w:cs="Arial"/>
+          <w:color w:val="000000" w:themeColor="text1"/>
+          <w:sz w:val="28"/>
+          <w:szCs w:val="28"/>
+        </w:rPr>
+      </w:pPr>
+      <w:bookmarkStart w:id="17" w:name="_Toc229498360"/>
+      <w:r>
+        <w:rPr>
+          <w:rFonts w:ascii="Arial" w:hAnsi="Arial" w:cs="Arial"/>
+          <w:color w:val="000000" w:themeColor="text1"/>
+          <w:sz w:val="28"/>
+          <w:szCs w:val="28"/>
         </w:rPr>
         <w:lastRenderedPageBreak/>
         <w:t>4. Formulario — agregar / editar tutor</w:t>
       </w:r>
+      <w:bookmarkEnd w:id="17"/>
     </w:p>
     <w:p>
       <w:pPr>
-        <w:rPr>
-          <w:rFonts w:ascii="Arial" w:hAnsi="Arial" w:cs="Arial"/>
-          <w:caps/>
-          <w:color w:val="9C9A92"/>
-          <w:spacing w:val="13"/>
-          <w:sz w:val="17"/>
-          <w:szCs w:val="17"/>
-        </w:rPr>
-      </w:pPr>
-    </w:p>
-    <w:p>
-      <w:pPr>
+        <w:spacing w:line="360" w:lineRule="auto"/>
         <w:rPr>
           <w:rFonts w:ascii="Arial" w:hAnsi="Arial" w:cs="Arial"/>
           <w:b/>
@@ -8723,9 +10255,9 @@
           <w:noProof/>
         </w:rPr>
         <w:drawing>
-          <wp:inline distT="0" distB="0" distL="0" distR="0" wp14:anchorId="7BEE21BA" wp14:editId="39E616D9">
-            <wp:extent cx="4603173" cy="3697783"/>
-            <wp:effectExtent l="0" t="0" r="0" b="0"/>
+          <wp:inline distT="0" distB="0" distL="0" distR="0" wp14:anchorId="7BEE21BA" wp14:editId="2AF5FC9D">
+            <wp:extent cx="4594225" cy="3690594"/>
+            <wp:effectExtent l="0" t="0" r="3175" b="5715"/>
             <wp:docPr id="1280401962" name="Imagen 5"/>
             <wp:cNvGraphicFramePr>
               <a:graphicFrameLocks xmlns:a="http://schemas.openxmlformats.org/drawingml/2006/main" noChangeAspect="1"/>
@@ -8752,7 +10284,7 @@
                   <pic:spPr>
                     <a:xfrm>
                       <a:off x="0" y="0"/>
-                      <a:ext cx="4667572" cy="3749515"/>
+                      <a:ext cx="4692447" cy="3769497"/>
                     </a:xfrm>
                     <a:prstGeom prst="rect">
                       <a:avLst/>
@@ -8767,53 +10299,29 @@
     </w:p>
     <w:p>
       <w:pPr>
-        <w:rPr>
-          <w:rFonts w:ascii="Arial" w:hAnsi="Arial" w:cs="Arial"/>
-          <w:caps/>
-          <w:color w:val="9C9A92"/>
-          <w:spacing w:val="13"/>
-          <w:sz w:val="17"/>
-          <w:szCs w:val="17"/>
-        </w:rPr>
-      </w:pPr>
+        <w:pStyle w:val="Ttulo2"/>
+        <w:rPr>
+          <w:rFonts w:ascii="Arial" w:hAnsi="Arial" w:cs="Arial"/>
+          <w:color w:val="000000" w:themeColor="text1"/>
+          <w:sz w:val="28"/>
+          <w:szCs w:val="28"/>
+        </w:rPr>
+      </w:pPr>
+      <w:bookmarkStart w:id="18" w:name="_Toc229498361"/>
+      <w:r>
+        <w:rPr>
+          <w:rFonts w:ascii="Arial" w:hAnsi="Arial" w:cs="Arial"/>
+          <w:color w:val="000000" w:themeColor="text1"/>
+          <w:sz w:val="28"/>
+          <w:szCs w:val="28"/>
+        </w:rPr>
+        <w:t>5. Perfil / detalle del tutor</w:t>
+      </w:r>
+      <w:bookmarkEnd w:id="18"/>
     </w:p>
     <w:p>
       <w:pPr>
-        <w:rPr>
-          <w:rFonts w:ascii="Arial" w:hAnsi="Arial" w:cs="Arial"/>
-          <w:caps/>
-          <w:color w:val="9C9A92"/>
-          <w:spacing w:val="13"/>
-          <w:sz w:val="17"/>
-          <w:szCs w:val="17"/>
-        </w:rPr>
-      </w:pPr>
-      <w:r>
-        <w:rPr>
-          <w:rFonts w:ascii="Arial" w:hAnsi="Arial" w:cs="Arial"/>
-          <w:caps/>
-          <w:color w:val="9C9A92"/>
-          <w:spacing w:val="13"/>
-          <w:sz w:val="17"/>
-          <w:szCs w:val="17"/>
-        </w:rPr>
-        <w:t>5. Perfil / detalle del tutor</w:t>
-      </w:r>
-    </w:p>
-    <w:p>
-      <w:pPr>
-        <w:rPr>
-          <w:rFonts w:ascii="Arial" w:hAnsi="Arial" w:cs="Arial"/>
-          <w:caps/>
-          <w:color w:val="9C9A92"/>
-          <w:spacing w:val="13"/>
-          <w:sz w:val="17"/>
-          <w:szCs w:val="17"/>
-        </w:rPr>
-      </w:pPr>
-    </w:p>
-    <w:p>
-      <w:pPr>
+        <w:spacing w:line="360" w:lineRule="auto"/>
         <w:rPr>
           <w:rFonts w:ascii="Arial" w:hAnsi="Arial" w:cs="Arial"/>
           <w:b/>
@@ -8828,9 +10336,9 @@
           <w:noProof/>
         </w:rPr>
         <w:drawing>
-          <wp:inline distT="0" distB="0" distL="0" distR="0" wp14:anchorId="3625EB31" wp14:editId="2864FB73">
-            <wp:extent cx="4788131" cy="3876033"/>
-            <wp:effectExtent l="0" t="0" r="0" b="0"/>
+          <wp:inline distT="0" distB="0" distL="0" distR="0" wp14:anchorId="3625EB31" wp14:editId="66BC8114">
+            <wp:extent cx="4594302" cy="3719127"/>
+            <wp:effectExtent l="0" t="0" r="3175" b="2540"/>
             <wp:docPr id="1197836061" name="Imagen 6"/>
             <wp:cNvGraphicFramePr>
               <a:graphicFrameLocks xmlns:a="http://schemas.openxmlformats.org/drawingml/2006/main" noChangeAspect="1"/>
@@ -8857,7 +10365,7 @@
                   <pic:spPr>
                     <a:xfrm>
                       <a:off x="0" y="0"/>
-                      <a:ext cx="4800537" cy="3886076"/>
+                      <a:ext cx="4617780" cy="3738133"/>
                     </a:xfrm>
                     <a:prstGeom prst="rect">
                       <a:avLst/>
@@ -8880,42 +10388,30 @@
     </w:p>
     <w:p>
       <w:pPr>
-        <w:rPr>
-          <w:rFonts w:ascii="Arial" w:hAnsi="Arial" w:cs="Arial"/>
-          <w:caps/>
-          <w:color w:val="9C9A92"/>
-          <w:spacing w:val="13"/>
-          <w:sz w:val="17"/>
-          <w:szCs w:val="17"/>
-        </w:rPr>
-      </w:pPr>
-      <w:r>
-        <w:rPr>
-          <w:rFonts w:ascii="Arial" w:hAnsi="Arial" w:cs="Arial"/>
-          <w:caps/>
-          <w:color w:val="9C9A92"/>
-          <w:spacing w:val="13"/>
-          <w:sz w:val="17"/>
-          <w:szCs w:val="17"/>
+        <w:pStyle w:val="Ttulo2"/>
+        <w:rPr>
+          <w:rFonts w:ascii="Arial" w:hAnsi="Arial" w:cs="Arial"/>
+          <w:color w:val="000000" w:themeColor="text1"/>
+          <w:sz w:val="28"/>
+          <w:szCs w:val="28"/>
+        </w:rPr>
+      </w:pPr>
+      <w:bookmarkStart w:id="19" w:name="_Toc229498362"/>
+      <w:r>
+        <w:rPr>
+          <w:rFonts w:ascii="Arial" w:hAnsi="Arial" w:cs="Arial"/>
+          <w:color w:val="000000" w:themeColor="text1"/>
+          <w:sz w:val="28"/>
+          <w:szCs w:val="28"/>
         </w:rPr>
         <w:lastRenderedPageBreak/>
         <w:t>6. Confirmar eliminación</w:t>
       </w:r>
+      <w:bookmarkEnd w:id="19"/>
     </w:p>
     <w:p>
       <w:pPr>
-        <w:rPr>
-          <w:rFonts w:ascii="Arial" w:hAnsi="Arial" w:cs="Arial"/>
-          <w:caps/>
-          <w:color w:val="9C9A92"/>
-          <w:spacing w:val="13"/>
-          <w:sz w:val="17"/>
-          <w:szCs w:val="17"/>
-        </w:rPr>
-      </w:pPr>
-    </w:p>
-    <w:p>
-      <w:pPr>
+        <w:spacing w:line="360" w:lineRule="auto"/>
         <w:rPr>
           <w:rFonts w:ascii="Arial" w:hAnsi="Arial" w:cs="Arial"/>
           <w:b/>
@@ -8930,7 +10426,7 @@
           <w:noProof/>
         </w:rPr>
         <w:drawing>
-          <wp:inline distT="0" distB="0" distL="0" distR="0" wp14:anchorId="76613B69" wp14:editId="2E2CE0AC">
+          <wp:inline distT="0" distB="0" distL="0" distR="0" wp14:anchorId="76613B69" wp14:editId="126278AF">
             <wp:extent cx="5943600" cy="3689985"/>
             <wp:effectExtent l="0" t="0" r="0" b="5715"/>
             <wp:docPr id="676110065" name="Imagen 7"/>
@@ -8974,75 +10470,39 @@
     </w:p>
     <w:p>
       <w:pPr>
-        <w:rPr>
-          <w:rFonts w:ascii="Arial" w:hAnsi="Arial" w:cs="Arial"/>
-          <w:caps/>
-          <w:color w:val="9C9A92"/>
+        <w:pStyle w:val="Ttulo2"/>
+        <w:rPr>
+          <w:rFonts w:ascii="Arial" w:hAnsi="Arial" w:cs="Arial"/>
+          <w:color w:val="000000" w:themeColor="text1"/>
+          <w:sz w:val="28"/>
+          <w:szCs w:val="28"/>
+        </w:rPr>
+      </w:pPr>
+      <w:bookmarkStart w:id="20" w:name="_Toc229498363"/>
+      <w:r>
+        <w:rPr>
+          <w:rFonts w:ascii="Arial" w:hAnsi="Arial" w:cs="Arial"/>
+          <w:color w:val="000000" w:themeColor="text1"/>
           <w:spacing w:val="13"/>
-          <w:sz w:val="17"/>
-          <w:szCs w:val="17"/>
-        </w:rPr>
-      </w:pPr>
+          <w:sz w:val="28"/>
+          <w:szCs w:val="28"/>
+        </w:rPr>
+        <w:t xml:space="preserve">7. </w:t>
+      </w:r>
+      <w:r>
+        <w:rPr>
+          <w:rFonts w:ascii="Arial" w:hAnsi="Arial" w:cs="Arial"/>
+          <w:color w:val="000000" w:themeColor="text1"/>
+          <w:sz w:val="28"/>
+          <w:szCs w:val="28"/>
+        </w:rPr>
+        <w:t>Registrar asistencia — vista del tutor</w:t>
+      </w:r>
+      <w:bookmarkEnd w:id="20"/>
     </w:p>
     <w:p>
       <w:pPr>
-        <w:rPr>
-          <w:rFonts w:ascii="Arial" w:hAnsi="Arial" w:cs="Arial"/>
-          <w:caps/>
-          <w:color w:val="9C9A92"/>
-          <w:spacing w:val="19"/>
-          <w:sz w:val="17"/>
-          <w:szCs w:val="17"/>
-        </w:rPr>
-      </w:pPr>
-      <w:r>
-        <w:rPr>
-          <w:rFonts w:ascii="Arial" w:hAnsi="Arial" w:cs="Arial"/>
-          <w:caps/>
-          <w:color w:val="9C9A92"/>
-          <w:spacing w:val="13"/>
-          <w:sz w:val="17"/>
-          <w:szCs w:val="17"/>
-        </w:rPr>
-        <w:t>7</w:t>
-      </w:r>
-      <w:r>
-        <w:rPr>
-          <w:rFonts w:ascii="Arial" w:hAnsi="Arial" w:cs="Arial"/>
-          <w:caps/>
-          <w:color w:val="9C9A92"/>
-          <w:spacing w:val="13"/>
-          <w:sz w:val="17"/>
-          <w:szCs w:val="17"/>
-        </w:rPr>
-        <w:t xml:space="preserve">. </w:t>
-      </w:r>
-      <w:r>
-        <w:rPr>
-          <w:rFonts w:ascii="Arial" w:hAnsi="Arial" w:cs="Arial"/>
-          <w:caps/>
-          <w:color w:val="9C9A92"/>
-          <w:spacing w:val="19"/>
-          <w:sz w:val="17"/>
-          <w:szCs w:val="17"/>
-        </w:rPr>
-        <w:t>Registrar asistencia — vista del tutor</w:t>
-      </w:r>
-    </w:p>
-    <w:p>
-      <w:pPr>
-        <w:rPr>
-          <w:rFonts w:ascii="Arial" w:hAnsi="Arial" w:cs="Arial"/>
-          <w:caps/>
-          <w:color w:val="9C9A92"/>
-          <w:spacing w:val="13"/>
-          <w:sz w:val="17"/>
-          <w:szCs w:val="17"/>
-        </w:rPr>
-      </w:pPr>
-    </w:p>
-    <w:p>
-      <w:pPr>
+        <w:spacing w:line="360" w:lineRule="auto"/>
         <w:rPr>
           <w:rFonts w:ascii="Arial" w:hAnsi="Arial" w:cs="Arial"/>
           <w:b/>
@@ -9101,71 +10561,30 @@
     </w:p>
     <w:p>
       <w:pPr>
-        <w:spacing w:after="160" w:line="278" w:lineRule="auto"/>
-        <w:rPr>
-          <w:rFonts w:ascii="Arial" w:hAnsi="Arial" w:cs="Arial"/>
-          <w:b/>
-          <w:bCs/>
-        </w:rPr>
-      </w:pPr>
-      <w:r>
-        <w:rPr>
-          <w:rFonts w:ascii="Arial" w:hAnsi="Arial" w:cs="Arial"/>
-          <w:b/>
-          <w:bCs/>
-        </w:rPr>
-        <w:br w:type="page"/>
-      </w:r>
+        <w:pStyle w:val="Ttulo2"/>
+        <w:rPr>
+          <w:rFonts w:ascii="Arial" w:hAnsi="Arial" w:cs="Arial"/>
+          <w:color w:val="000000" w:themeColor="text1"/>
+          <w:sz w:val="28"/>
+          <w:szCs w:val="28"/>
+        </w:rPr>
+      </w:pPr>
+      <w:bookmarkStart w:id="21" w:name="_Toc229498364"/>
+      <w:r>
+        <w:rPr>
+          <w:rFonts w:ascii="Arial" w:hAnsi="Arial" w:cs="Arial"/>
+          <w:color w:val="000000" w:themeColor="text1"/>
+          <w:sz w:val="28"/>
+          <w:szCs w:val="28"/>
+        </w:rPr>
+        <w:lastRenderedPageBreak/>
+        <w:t>8. Resumen de asistencia — cálculo del 80%</w:t>
+      </w:r>
+      <w:bookmarkEnd w:id="21"/>
     </w:p>
     <w:p>
       <w:pPr>
-        <w:rPr>
-          <w:rFonts w:ascii="Arial" w:hAnsi="Arial" w:cs="Arial"/>
-          <w:caps/>
-          <w:color w:val="9C9A92"/>
-          <w:spacing w:val="13"/>
-          <w:sz w:val="17"/>
-          <w:szCs w:val="17"/>
-        </w:rPr>
-      </w:pPr>
-      <w:r>
-        <w:rPr>
-          <w:rFonts w:ascii="Arial" w:hAnsi="Arial" w:cs="Arial"/>
-          <w:caps/>
-          <w:color w:val="9C9A92"/>
-          <w:spacing w:val="13"/>
-          <w:sz w:val="17"/>
-          <w:szCs w:val="17"/>
-        </w:rPr>
-        <w:lastRenderedPageBreak/>
-        <w:t>8</w:t>
-      </w:r>
-      <w:r>
-        <w:rPr>
-          <w:rFonts w:ascii="Arial" w:hAnsi="Arial" w:cs="Arial"/>
-          <w:caps/>
-          <w:color w:val="9C9A92"/>
-          <w:spacing w:val="13"/>
-          <w:sz w:val="17"/>
-          <w:szCs w:val="17"/>
-        </w:rPr>
-        <w:t>. Resumen de asistencia — cálculo del 80%</w:t>
-      </w:r>
-    </w:p>
-    <w:p>
-      <w:pPr>
-        <w:rPr>
-          <w:rFonts w:ascii="Arial" w:hAnsi="Arial" w:cs="Arial"/>
-          <w:caps/>
-          <w:color w:val="9C9A92"/>
-          <w:spacing w:val="13"/>
-          <w:sz w:val="17"/>
-          <w:szCs w:val="17"/>
-        </w:rPr>
-      </w:pPr>
-    </w:p>
-    <w:p>
-      <w:pPr>
+        <w:spacing w:line="360" w:lineRule="auto"/>
         <w:rPr>
           <w:rFonts w:ascii="Arial" w:hAnsi="Arial" w:cs="Arial"/>
           <w:b/>
@@ -9181,9 +10600,9 @@
           <w14:ligatures w14:val="standardContextual"/>
         </w:rPr>
         <w:drawing>
-          <wp:inline distT="0" distB="0" distL="0" distR="0" wp14:anchorId="35BB4038" wp14:editId="0FCA5186">
-            <wp:extent cx="5995555" cy="3564481"/>
-            <wp:effectExtent l="0" t="0" r="0" b="4445"/>
+          <wp:inline distT="0" distB="0" distL="0" distR="0" wp14:anchorId="35BB4038" wp14:editId="21F17FF4">
+            <wp:extent cx="5798634" cy="3447408"/>
+            <wp:effectExtent l="0" t="0" r="5715" b="0"/>
             <wp:docPr id="1983384027" name="Imagen 2"/>
             <wp:cNvGraphicFramePr>
               <a:graphicFrameLocks xmlns:a="http://schemas.openxmlformats.org/drawingml/2006/main" noChangeAspect="1"/>
@@ -9210,7 +10629,7 @@
                   <pic:spPr>
                     <a:xfrm>
                       <a:off x="0" y="0"/>
-                      <a:ext cx="6008905" cy="3572418"/>
+                      <a:ext cx="5819656" cy="3459906"/>
                     </a:xfrm>
                     <a:prstGeom prst="rect">
                       <a:avLst/>
@@ -9225,61 +10644,39 @@
     </w:p>
     <w:p>
       <w:pPr>
-        <w:rPr>
-          <w:rFonts w:ascii="Arial" w:hAnsi="Arial" w:cs="Arial"/>
-          <w:b/>
-          <w:bCs/>
-        </w:rPr>
-      </w:pPr>
+        <w:pStyle w:val="Ttulo2"/>
+        <w:rPr>
+          <w:rFonts w:ascii="Arial" w:hAnsi="Arial" w:cs="Arial"/>
+          <w:color w:val="000000" w:themeColor="text1"/>
+          <w:sz w:val="28"/>
+          <w:szCs w:val="28"/>
+        </w:rPr>
+      </w:pPr>
+      <w:bookmarkStart w:id="22" w:name="_Toc229498365"/>
+      <w:r>
+        <w:rPr>
+          <w:rFonts w:ascii="Arial" w:hAnsi="Arial" w:cs="Arial"/>
+          <w:color w:val="000000" w:themeColor="text1"/>
+          <w:spacing w:val="13"/>
+          <w:sz w:val="28"/>
+          <w:szCs w:val="28"/>
+        </w:rPr>
+        <w:t xml:space="preserve">9. </w:t>
+      </w:r>
+      <w:r>
+        <w:rPr>
+          <w:rFonts w:ascii="Arial" w:hAnsi="Arial" w:cs="Arial"/>
+          <w:color w:val="000000" w:themeColor="text1"/>
+          <w:sz w:val="28"/>
+          <w:szCs w:val="28"/>
+        </w:rPr>
+        <w:t>Detección de necesidades — formulario</w:t>
+      </w:r>
+      <w:bookmarkEnd w:id="22"/>
     </w:p>
     <w:p>
       <w:pPr>
-        <w:rPr>
-          <w:rFonts w:ascii="Arial" w:hAnsi="Arial" w:cs="Arial"/>
-          <w:caps/>
-          <w:color w:val="9C9A92"/>
-          <w:spacing w:val="19"/>
-          <w:sz w:val="17"/>
-          <w:szCs w:val="17"/>
-        </w:rPr>
-      </w:pPr>
-      <w:r>
-        <w:rPr>
-          <w:rFonts w:ascii="Arial" w:hAnsi="Arial" w:cs="Arial"/>
-          <w:caps/>
-          <w:color w:val="9C9A92"/>
-          <w:spacing w:val="13"/>
-          <w:sz w:val="17"/>
-          <w:szCs w:val="17"/>
-        </w:rPr>
-        <w:t>9</w:t>
-      </w:r>
-      <w:r>
-        <w:rPr>
-          <w:rFonts w:ascii="Arial" w:hAnsi="Arial" w:cs="Arial"/>
-          <w:caps/>
-          <w:color w:val="9C9A92"/>
-          <w:spacing w:val="13"/>
-          <w:sz w:val="17"/>
-          <w:szCs w:val="17"/>
-        </w:rPr>
-        <w:t xml:space="preserve">. </w:t>
-      </w:r>
-      <w:r>
-        <w:rPr>
-          <w:rFonts w:ascii="Arial" w:hAnsi="Arial" w:cs="Arial"/>
-          <w:caps/>
-          <w:color w:val="9C9A92"/>
-          <w:spacing w:val="19"/>
-          <w:sz w:val="17"/>
-          <w:szCs w:val="17"/>
-        </w:rPr>
-        <w:t>Detección de necesidades — formulario</w:t>
-      </w:r>
-    </w:p>
-    <w:p/>
-    <w:p>
-      <w:pPr>
+        <w:spacing w:line="360" w:lineRule="auto"/>
         <w:rPr>
           <w:rFonts w:ascii="Arial" w:hAnsi="Arial" w:cs="Arial"/>
           <w:b/>
@@ -9339,13 +10736,9 @@
     </w:p>
     <w:p>
       <w:pPr>
-        <w:rPr>
-          <w:rFonts w:ascii="Arial" w:hAnsi="Arial" w:cs="Arial"/>
-          <w:caps/>
-          <w:color w:val="9C9A92"/>
-          <w:spacing w:val="19"/>
-          <w:sz w:val="17"/>
-          <w:szCs w:val="17"/>
+        <w:pStyle w:val="Ttulo2"/>
+        <w:rPr>
+          <w:rFonts w:ascii="Arial" w:hAnsi="Arial" w:cs="Arial"/>
         </w:rPr>
       </w:pPr>
       <w:r>
@@ -9356,56 +10749,32 @@
         </w:rPr>
         <w:br w:type="page"/>
       </w:r>
-      <w:r>
-        <w:rPr>
-          <w:rFonts w:ascii="Arial" w:hAnsi="Arial" w:cs="Arial"/>
-          <w:caps/>
-          <w:color w:val="9C9A92"/>
+      <w:bookmarkStart w:id="23" w:name="_Toc229498366"/>
+      <w:r>
+        <w:rPr>
+          <w:rFonts w:ascii="Arial" w:hAnsi="Arial" w:cs="Arial"/>
+          <w:color w:val="000000" w:themeColor="text1"/>
           <w:spacing w:val="13"/>
-          <w:sz w:val="17"/>
-          <w:szCs w:val="17"/>
+          <w:sz w:val="28"/>
+          <w:szCs w:val="28"/>
         </w:rPr>
         <w:lastRenderedPageBreak/>
-        <w:t>10</w:t>
-      </w:r>
-      <w:r>
-        <w:rPr>
-          <w:rFonts w:ascii="Arial" w:hAnsi="Arial" w:cs="Arial"/>
-          <w:caps/>
-          <w:color w:val="9C9A92"/>
-          <w:spacing w:val="13"/>
-          <w:sz w:val="17"/>
-          <w:szCs w:val="17"/>
-        </w:rPr>
-        <w:t xml:space="preserve">. </w:t>
-      </w:r>
-      <w:r>
-        <w:rPr>
-          <w:rFonts w:ascii="Arial" w:hAnsi="Arial" w:cs="Arial"/>
-          <w:caps/>
-          <w:color w:val="9C9A92"/>
-          <w:spacing w:val="19"/>
-          <w:sz w:val="17"/>
-          <w:szCs w:val="17"/>
+        <w:t xml:space="preserve">10. </w:t>
+      </w:r>
+      <w:r>
+        <w:rPr>
+          <w:rFonts w:ascii="Arial" w:hAnsi="Arial" w:cs="Arial"/>
+          <w:color w:val="000000" w:themeColor="text1"/>
+          <w:sz w:val="28"/>
+          <w:szCs w:val="28"/>
         </w:rPr>
         <w:t>Reporte de sesión — Anexo 19</w:t>
       </w:r>
+      <w:bookmarkEnd w:id="23"/>
     </w:p>
     <w:p>
       <w:pPr>
-        <w:rPr>
-          <w:rFonts w:ascii="Arial" w:hAnsi="Arial" w:cs="Arial"/>
-          <w:caps/>
-          <w:color w:val="9C9A92"/>
-          <w:spacing w:val="19"/>
-          <w:sz w:val="17"/>
-          <w:szCs w:val="17"/>
-        </w:rPr>
-      </w:pPr>
-    </w:p>
-    <w:p>
-      <w:pPr>
-        <w:spacing w:after="160" w:line="278" w:lineRule="auto"/>
+        <w:spacing w:after="160" w:line="360" w:lineRule="auto"/>
         <w:rPr>
           <w:rFonts w:ascii="Arial" w:hAnsi="Arial" w:cs="Arial"/>
           <w:b/>
@@ -9465,64 +10834,39 @@
     </w:p>
     <w:p>
       <w:pPr>
-        <w:rPr>
-          <w:rFonts w:ascii="Arial" w:hAnsi="Arial" w:cs="Arial"/>
-          <w:caps/>
-          <w:color w:val="9C9A92"/>
-          <w:spacing w:val="19"/>
-          <w:sz w:val="17"/>
-          <w:szCs w:val="17"/>
-        </w:rPr>
-      </w:pPr>
-      <w:r>
-        <w:rPr>
-          <w:rFonts w:ascii="Arial" w:hAnsi="Arial" w:cs="Arial"/>
-          <w:caps/>
-          <w:color w:val="9C9A92"/>
+        <w:pStyle w:val="Ttulo2"/>
+        <w:rPr>
+          <w:rFonts w:ascii="Arial" w:hAnsi="Arial" w:cs="Arial"/>
+          <w:color w:val="000000" w:themeColor="text1"/>
+          <w:sz w:val="28"/>
+          <w:szCs w:val="28"/>
+        </w:rPr>
+      </w:pPr>
+      <w:bookmarkStart w:id="24" w:name="_Toc229498367"/>
+      <w:r>
+        <w:rPr>
+          <w:rFonts w:ascii="Arial" w:hAnsi="Arial" w:cs="Arial"/>
+          <w:color w:val="000000" w:themeColor="text1"/>
           <w:spacing w:val="13"/>
-          <w:sz w:val="17"/>
-          <w:szCs w:val="17"/>
-        </w:rPr>
-        <w:t>1</w:t>
-      </w:r>
-      <w:r>
-        <w:rPr>
-          <w:rFonts w:ascii="Arial" w:hAnsi="Arial" w:cs="Arial"/>
-          <w:caps/>
-          <w:color w:val="9C9A92"/>
-          <w:spacing w:val="13"/>
-          <w:sz w:val="17"/>
-          <w:szCs w:val="17"/>
-        </w:rPr>
-        <w:t>1</w:t>
-      </w:r>
-      <w:r>
-        <w:rPr>
-          <w:rFonts w:ascii="Arial" w:hAnsi="Arial" w:cs="Arial"/>
-          <w:caps/>
-          <w:color w:val="9C9A92"/>
-          <w:spacing w:val="13"/>
-          <w:sz w:val="17"/>
-          <w:szCs w:val="17"/>
-        </w:rPr>
-        <w:t xml:space="preserve">. </w:t>
-      </w:r>
-      <w:r>
-        <w:rPr>
-          <w:rFonts w:ascii="Arial" w:hAnsi="Arial" w:cs="Arial"/>
-          <w:caps/>
-          <w:color w:val="9C9A92"/>
-          <w:spacing w:val="19"/>
-          <w:sz w:val="17"/>
-          <w:szCs w:val="17"/>
+          <w:sz w:val="28"/>
+          <w:szCs w:val="28"/>
+        </w:rPr>
+        <w:t xml:space="preserve">11. </w:t>
+      </w:r>
+      <w:r>
+        <w:rPr>
+          <w:rFonts w:ascii="Arial" w:hAnsi="Arial" w:cs="Arial"/>
+          <w:color w:val="000000" w:themeColor="text1"/>
+          <w:sz w:val="28"/>
+          <w:szCs w:val="28"/>
         </w:rPr>
         <w:t>Evidencias de sesión — validación</w:t>
       </w:r>
+      <w:bookmarkEnd w:id="24"/>
     </w:p>
-    <w:p/>
     <w:p>
       <w:pPr>
-        <w:spacing w:after="160" w:line="278" w:lineRule="auto"/>
+        <w:spacing w:after="160" w:line="360" w:lineRule="auto"/>
         <w:rPr>
           <w:rFonts w:ascii="Arial" w:hAnsi="Arial" w:cs="Arial"/>
           <w:b/>
@@ -9583,45 +10927,41 @@
     <w:p>
       <w:pPr>
         <w:pStyle w:val="Ttulo1"/>
+        <w:spacing w:line="360" w:lineRule="auto"/>
+        <w:jc w:val="center"/>
         <w:rPr>
           <w:rFonts w:ascii="Arial" w:hAnsi="Arial" w:cs="Arial"/>
           <w:b/>
           <w:bCs/>
+          <w:color w:val="000000" w:themeColor="text1"/>
           <w:sz w:val="36"/>
           <w:szCs w:val="36"/>
         </w:rPr>
       </w:pPr>
-      <w:bookmarkStart w:id="7" w:name="_Toc227795042"/>
+      <w:bookmarkStart w:id="25" w:name="_Toc229498368"/>
       <w:r>
         <w:rPr>
           <w:rFonts w:ascii="Arial" w:hAnsi="Arial" w:cs="Arial"/>
           <w:b/>
           <w:bCs/>
+          <w:color w:val="000000" w:themeColor="text1"/>
           <w:sz w:val="36"/>
           <w:szCs w:val="36"/>
         </w:rPr>
         <w:lastRenderedPageBreak/>
         <w:t>Diagrama E-R</w:t>
       </w:r>
-      <w:bookmarkEnd w:id="7"/>
-      <w:r>
-        <w:rPr>
-          <w:rFonts w:ascii="Arial" w:hAnsi="Arial" w:cs="Arial"/>
-          <w:b/>
-          <w:bCs/>
-          <w:sz w:val="36"/>
-          <w:szCs w:val="36"/>
-        </w:rPr>
-        <w:t xml:space="preserve"> </w:t>
-      </w:r>
+      <w:bookmarkEnd w:id="25"/>
     </w:p>
     <w:p>
       <w:pPr>
+        <w:spacing w:line="360" w:lineRule="auto"/>
         <w:jc w:val="center"/>
         <w:rPr>
           <w:rFonts w:ascii="Arial" w:hAnsi="Arial" w:cs="Arial"/>
           <w:b/>
           <w:bCs/>
+          <w:lang w:val="es-ES"/>
         </w:rPr>
       </w:pPr>
       <w:r>
@@ -10743,7 +12083,6 @@
     <w:next w:val="Normal"/>
     <w:link w:val="Ttulo3Car"/>
     <w:uiPriority w:val="9"/>
-    <w:semiHidden/>
     <w:unhideWhenUsed/>
     <w:qFormat/>
     <w:rsid w:val="00171D12"/>
@@ -10971,7 +12310,6 @@
     <w:basedOn w:val="Fuentedeprrafopredeter"/>
     <w:link w:val="Ttulo3"/>
     <w:uiPriority w:val="9"/>
-    <w:semiHidden/>
     <w:rsid w:val="00171D12"/>
     <w:rPr>
       <w:rFonts w:eastAsiaTheme="majorEastAsia" w:cstheme="majorBidi"/>
@@ -11771,7 +13109,6 @@
     <w:next w:val="Normal"/>
     <w:autoRedefine/>
     <w:uiPriority w:val="39"/>
-    <w:semiHidden/>
     <w:unhideWhenUsed/>
     <w:rsid w:val="00816938"/>
     <w:pPr>

</xml_diff>